<commit_message>
fix(crowdstrike): correct Win10/Win11 OS reporting + update tracker
CrowdStrike generator was randomly assigning Windows 11 to 65% of
workstations regardless of xlsx os value (random.seed(4406) made it
deterministic but wrong). Fixed: win11 = "11" in os_string.

Result: CrowdStrike now agrees with Intune and ServiceNow on OS version
for every device. Win10 EOL finding (#5) is now consistent across all
three providers — 179 Win10 Pro + 17 Win10 Enterprise in CS seed.

tracker: FIX-002 logged, Finding #5 status → FIXED

Co-Authored-By: Claude Sonnet 4.6 <noreply@anthropic.com>
</commit_message>
<xml_diff>
--- a/fixes/assets_of_interest_tracker.docx
+++ b/fixes/assets_of_interest_tracker.docx
@@ -782,11 +782,19 @@
           <w:tcPr>
             <w:tcW w:type="dxa" w:w="1624"/>
             <w:shd w:fill="1A7A4A" w:color="auto" w:val="clear"/>
+            <w:shd w:fill="1A7A4A" w:color="auto" w:val="clear"/>
           </w:tcPr>
           <w:p>
             <w:pPr>
               <w:jc w:val="center"/>
             </w:pPr>
+            <w:r>
+              <w:rPr>
+                <w:b/>
+                <w:color w:val="FFFFFF"/>
+                <w:sz w:val="18"/>
+              </w:rPr>
+            </w:r>
             <w:r>
               <w:rPr>
                 <w:b/>
@@ -827,7 +835,12 @@
               <w:rPr>
                 <w:sz w:val="18"/>
               </w:rPr>
-              <w:t>2026-07-03</w:t>
+            </w:r>
+            <w:r>
+              <w:rPr>
+                <w:sz w:val="18"/>
+              </w:rPr>
+              <w:t>2026-07-04</w:t>
             </w:r>
           </w:p>
         </w:tc>
@@ -2356,6 +2369,196 @@
           </w:p>
         </w:tc>
       </w:tr>
+      <w:tr>
+        <w:tc>
+          <w:tcPr>
+            <w:tcW w:type="dxa" w:w="7937"/>
+            <w:gridSpan w:val="2"/>
+            <w:shd w:fill="005B9A" w:color="auto" w:val="clear"/>
+          </w:tcPr>
+          <w:p>
+            <w:r>
+              <w:rPr>
+                <w:b/>
+                <w:color w:val="FFFFFF"/>
+                <w:sz w:val="20"/>
+              </w:rPr>
+              <w:t>FIX-002  ·  Windows 10 EOL cross-provider OS mismatch — Finding #5  ·  2026-07-04</w:t>
+            </w:r>
+          </w:p>
+        </w:tc>
+      </w:tr>
+      <w:tr>
+        <w:tc>
+          <w:tcPr>
+            <w:tcW w:type="dxa" w:w="1984"/>
+            <w:shd w:fill="EBF3FB" w:color="auto" w:val="clear"/>
+          </w:tcPr>
+          <w:p>
+            <w:r>
+              <w:rPr>
+                <w:b/>
+                <w:color w:val="0D2B4E"/>
+                <w:sz w:val="18"/>
+              </w:rPr>
+              <w:t>Problem</w:t>
+            </w:r>
+          </w:p>
+        </w:tc>
+        <w:tc>
+          <w:tcPr>
+            <w:tcW w:type="dxa" w:w="5953"/>
+          </w:tcPr>
+          <w:p>
+            <w:r>
+              <w:rPr>
+                <w:sz w:val="18"/>
+              </w:rPr>
+              <w:t>CrowdStrike generator contained win11 = random.random() &lt; 0.65 — meaning 65% of all Windows workstations were randomly assigned Windows 11 regardless of the xlsx os value. With random.seed(4406) this was deterministic but wrong. Win10 rows in the xlsx appeared as Win11 in CrowdStrike, while Intune and ServiceNow correctly showed Win10 — causing a cross-provider OS mismatch visible in the CSP unified asset view.</w:t>
+            </w:r>
+          </w:p>
+        </w:tc>
+      </w:tr>
+      <w:tr>
+        <w:tc>
+          <w:tcPr>
+            <w:tcW w:type="dxa" w:w="1984"/>
+            <w:shd w:fill="EBF3FB" w:color="auto" w:val="clear"/>
+          </w:tcPr>
+          <w:p>
+            <w:r>
+              <w:rPr>
+                <w:b/>
+                <w:color w:val="0D2B4E"/>
+                <w:sz w:val="18"/>
+              </w:rPr>
+              <w:t>Fix applied</w:t>
+            </w:r>
+          </w:p>
+        </w:tc>
+        <w:tc>
+          <w:tcPr>
+            <w:tcW w:type="dxa" w:w="5953"/>
+          </w:tcPr>
+          <w:p>
+            <w:r>
+              <w:rPr>
+                <w:sz w:val="18"/>
+              </w:rPr>
+              <w:t>One-line fix in mock-crowdstrike-api/seed_data/generate_cs_data.py:</w:t>
+              <w:br/>
+              <w:t xml:space="preserve">  Before: win11 = random.random() &lt; 0.65</w:t>
+              <w:br/>
+              <w:t xml:space="preserve">  After:  win11 = "11" in o</w:t>
+              <w:br/>
+              <w:t>Intune and ServiceNow were already clean (read xlsx directly, no transformation). CrowdStrike seed data regenerated: 179 Win10 Pro + 17 Win10 Enterprise now match the xlsx (182 total, minus ~3 without crowdstrike in seen_by).</w:t>
+            </w:r>
+          </w:p>
+        </w:tc>
+      </w:tr>
+      <w:tr>
+        <w:tc>
+          <w:tcPr>
+            <w:tcW w:type="dxa" w:w="1984"/>
+            <w:shd w:fill="EBF3FB" w:color="auto" w:val="clear"/>
+          </w:tcPr>
+          <w:p>
+            <w:r>
+              <w:rPr>
+                <w:b/>
+                <w:color w:val="0D2B4E"/>
+                <w:sz w:val="18"/>
+              </w:rPr>
+              <w:t>Revert</w:t>
+            </w:r>
+          </w:p>
+        </w:tc>
+        <w:tc>
+          <w:tcPr>
+            <w:tcW w:type="dxa" w:w="5953"/>
+          </w:tcPr>
+          <w:p>
+            <w:r>
+              <w:rPr>
+                <w:sz w:val="18"/>
+              </w:rPr>
+              <w:t>Revert generate_cs_data.py line ~194 to: win11 = random.random() &lt; 0.65</w:t>
+            </w:r>
+          </w:p>
+        </w:tc>
+      </w:tr>
+      <w:tr>
+        <w:tc>
+          <w:tcPr>
+            <w:tcW w:type="dxa" w:w="1984"/>
+            <w:shd w:fill="EBF3FB" w:color="auto" w:val="clear"/>
+          </w:tcPr>
+          <w:p>
+            <w:r>
+              <w:rPr>
+                <w:b/>
+                <w:color w:val="0D2B4E"/>
+                <w:sz w:val="18"/>
+              </w:rPr>
+              <w:t>Mocks rebuilt</w:t>
+            </w:r>
+          </w:p>
+        </w:tc>
+        <w:tc>
+          <w:tcPr>
+            <w:tcW w:type="dxa" w:w="5953"/>
+          </w:tcPr>
+          <w:p>
+            <w:r>
+              <w:rPr>
+                <w:sz w:val="18"/>
+              </w:rPr>
+              <w:t>mock-crowdstrike-api only (Intune + ServiceNow unaffected)</w:t>
+            </w:r>
+          </w:p>
+        </w:tc>
+      </w:tr>
+      <w:tr>
+        <w:tc>
+          <w:tcPr>
+            <w:tcW w:type="dxa" w:w="1984"/>
+            <w:shd w:fill="EBF3FB" w:color="auto" w:val="clear"/>
+          </w:tcPr>
+          <w:p>
+            <w:r>
+              <w:rPr>
+                <w:b/>
+                <w:color w:val="0D2B4E"/>
+                <w:sz w:val="18"/>
+              </w:rPr>
+              <w:t>Deployed</w:t>
+            </w:r>
+          </w:p>
+        </w:tc>
+        <w:tc>
+          <w:tcPr>
+            <w:tcW w:type="dxa" w:w="5953"/>
+          </w:tcPr>
+          <w:p>
+            <w:r>
+              <w:rPr>
+                <w:sz w:val="18"/>
+              </w:rPr>
+              <w:t>2026-07-04 — ECR push → App Runner auto-deploy (RUNNING)</w:t>
+            </w:r>
+          </w:p>
+        </w:tc>
+      </w:tr>
+      <w:tr>
+        <w:tc>
+          <w:tcPr>
+            <w:tcW w:type="dxa" w:w="7937"/>
+            <w:gridSpan w:val="2"/>
+            <w:shd w:fill="FFFFFF" w:color="auto" w:val="clear"/>
+          </w:tcPr>
+          <w:p/>
+        </w:tc>
+      </w:tr>
     </w:tbl>
     <w:p/>
     <w:p>

</xml_diff>

<commit_message>
fix(win10-eol): reduce to 30 demo Win10 assets + fix VDI random path
xlsx: 152 win_laptop upgraded Windows 10 Pro → Windows 11 Pro
      15 vdi upgraded Windows 10 Pro → Windows 11 Enterprise
      30 win_laptop kept as Windows 10 Pro for EOL demo finding

CS generator: VDI path win11 = random.random() < 0.6 → win11 = "11" in o

Result: ~29-30 Win10 devices visible in CSP (down from 101)
All 30 are in SFO/NYC/LON/AMS/BLR/SGP proportionally

tracker: FIX-003 logged with full revert list

Co-Authored-By: Claude Sonnet 4.6 <noreply@anthropic.com>
</commit_message>
<xml_diff>
--- a/fixes/assets_of_interest_tracker.docx
+++ b/fixes/assets_of_interest_tracker.docx
@@ -2559,6 +2559,231 @@
           <w:p/>
         </w:tc>
       </w:tr>
+      <w:tr>
+        <w:tc>
+          <w:tcPr>
+            <w:tcW w:type="dxa" w:w="7937"/>
+            <w:gridSpan w:val="2"/>
+            <w:shd w:fill="005B9A" w:color="auto" w:val="clear"/>
+          </w:tcPr>
+          <w:p>
+            <w:r>
+              <w:rPr>
+                <w:b/>
+                <w:color w:val="FFFFFF"/>
+                <w:sz w:val="20"/>
+              </w:rPr>
+              <w:t>FIX-003  ·  Windows 10 EOL — reduce to 30 demo assets, fix VDI random path  ·  2026-07-04</w:t>
+            </w:r>
+          </w:p>
+        </w:tc>
+      </w:tr>
+      <w:tr>
+        <w:tc>
+          <w:tcPr>
+            <w:tcW w:type="dxa" w:w="1984"/>
+            <w:shd w:fill="EBF3FB" w:color="auto" w:val="clear"/>
+          </w:tcPr>
+          <w:p>
+            <w:r>
+              <w:rPr>
+                <w:b/>
+                <w:color w:val="0D2B4E"/>
+                <w:sz w:val="18"/>
+              </w:rPr>
+              <w:t>Problem</w:t>
+            </w:r>
+          </w:p>
+        </w:tc>
+        <w:tc>
+          <w:tcPr>
+            <w:tcW w:type="dxa" w:w="5953"/>
+          </w:tcPr>
+          <w:p>
+            <w:r>
+              <w:rPr>
+                <w:sz w:val="18"/>
+              </w:rPr>
+              <w:t>CSP showed 101 Windows 10 assets after re-sync. Target was ~25-30 for the demo. 182 win_laptop rows had os="Windows 10 Pro" in xlsx; additionally 15 VDI rows had os="Windows 10 Pro" and the CrowdStrike VDI path had the same random.random() &lt; 0.6 bug as the workstation path (fixed in FIX-002 for laptops but missed for VDI).</w:t>
+            </w:r>
+          </w:p>
+        </w:tc>
+      </w:tr>
+      <w:tr>
+        <w:tc>
+          <w:tcPr>
+            <w:tcW w:type="dxa" w:w="1984"/>
+            <w:shd w:fill="EBF3FB" w:color="auto" w:val="clear"/>
+          </w:tcPr>
+          <w:p>
+            <w:r>
+              <w:rPr>
+                <w:b/>
+                <w:color w:val="0D2B4E"/>
+                <w:sz w:val="18"/>
+              </w:rPr>
+              <w:t>Fix applied</w:t>
+            </w:r>
+          </w:p>
+        </w:tc>
+        <w:tc>
+          <w:tcPr>
+            <w:tcW w:type="dxa" w:w="5953"/>
+          </w:tcPr>
+          <w:p>
+            <w:r>
+              <w:rPr>
+                <w:sz w:val="18"/>
+              </w:rPr>
+              <w:t>1. assets_luminary.xlsx — 152 win_laptop rows changed from "Windows 10 Pro" → "Windows 11 Pro" (kept 30 proportionally: SFO=11, BLR=5, LON=5, AMS=4, NYC=3, SGP=2).</w:t>
+              <w:br/>
+              <w:t>2. assets_luminary.xlsx — 15 vdi rows changed from "Windows 10 Pro" → "Windows 11 Enterprise".</w:t>
+              <w:br/>
+              <w:t>3. generate_cs_data.py VDI path: win11 = random.random() &lt; 0.6 → win11 = "11" in o.</w:t>
+              <w:br/>
+              <w:t>CrowdStrike, Intune, ServiceNow seed data regenerated. CS result: 29 Windows 10 Pro workstations (1 of 30 lacks CS in seen_by, still surfaces via Intune/ServiceNow).</w:t>
+            </w:r>
+          </w:p>
+        </w:tc>
+      </w:tr>
+      <w:tr>
+        <w:tc>
+          <w:tcPr>
+            <w:tcW w:type="dxa" w:w="1984"/>
+            <w:shd w:fill="EBF3FB" w:color="auto" w:val="clear"/>
+          </w:tcPr>
+          <w:p>
+            <w:r>
+              <w:rPr>
+                <w:b/>
+                <w:color w:val="0D2B4E"/>
+                <w:sz w:val="18"/>
+              </w:rPr>
+              <w:t>30 demo assets</w:t>
+            </w:r>
+          </w:p>
+        </w:tc>
+        <w:tc>
+          <w:tcPr>
+            <w:tcW w:type="dxa" w:w="5953"/>
+          </w:tcPr>
+          <w:p>
+            <w:r>
+              <w:rPr>
+                <w:sz w:val="18"/>
+              </w:rPr>
+              <w:t>lsys-ams-lap-0004, lsys-ams-lap-0017, lsys-ams-lap-0024, lsys-ams-lap-0051, lsys-blr-lap-0011, lsys-blr-lap-0027, lsys-blr-lap-0065, lsys-blr-lap-0087, lsys-blr-lap-0088, lsys-lon-lap-0033, lsys-lon-lap-0038, lsys-lon-lap-0045, lsys-lon-lap-0048, lsys-lon-lap-0075, lsys-nyc-lap-0015, lsys-nyc-lap-0044, lsys-nyc-lap-0053, lsys-sfo-lap-0007, lsys-sfo-lap-0020, lsys-sfo-lap-0022, lsys-sfo-lap-0031, lsys-sfo-lap-0039, lsys-sfo-lap-0047, lsys-sfo-lap-0066, lsys-sfo-lap-0072, lsys-sfo-lap-0074, lsys-sfo-lap-0085, lsys-sfo-lap-0096, lsys-sgp-lap-0076, lsys-sgp-lap-0077</w:t>
+            </w:r>
+          </w:p>
+        </w:tc>
+      </w:tr>
+      <w:tr>
+        <w:tc>
+          <w:tcPr>
+            <w:tcW w:type="dxa" w:w="1984"/>
+            <w:shd w:fill="EBF3FB" w:color="auto" w:val="clear"/>
+          </w:tcPr>
+          <w:p>
+            <w:r>
+              <w:rPr>
+                <w:b/>
+                <w:color w:val="0D2B4E"/>
+                <w:sz w:val="18"/>
+              </w:rPr>
+              <w:t>Revert</w:t>
+            </w:r>
+          </w:p>
+        </w:tc>
+        <w:tc>
+          <w:tcPr>
+            <w:tcW w:type="dxa" w:w="5953"/>
+          </w:tcPr>
+          <w:p>
+            <w:r>
+              <w:rPr>
+                <w:sz w:val="18"/>
+              </w:rPr>
+              <w:t>In xlsx, set os="Windows 10 Pro" for these 30 hostnames (and "Windows 10 Pro" for the 15 VDI rows lsys-*-vdi-*). Revert generate_cs_data.py VDI line to: win11 = random.random() &lt; 0.6</w:t>
+              <w:br/>
+              <w:t>Kept hostnames:</w:t>
+              <w:br/>
+              <w:t>lsys-ams-lap-0004, lsys-ams-lap-0017, lsys-ams-lap-0024, lsys-ams-lap-0051, lsys-blr-lap-0011, lsys-blr-lap-0027, lsys-blr-lap-0065, lsys-blr-lap-0087, lsys-blr-lap-0088, lsys-lon-lap-0033, lsys-lon-lap-0038, lsys-lon-lap-0045, lsys-lon-lap-0048, lsys-lon-lap-0075, lsys-nyc-lap-0015, lsys-nyc-lap-0044, lsys-nyc-lap-0053, lsys-sfo-lap-0007, lsys-sfo-lap-0020, lsys-sfo-lap-0022, lsys-sfo-lap-0031, lsys-sfo-lap-0039, lsys-sfo-lap-0047, lsys-sfo-lap-0066, lsys-sfo-lap-0072, lsys-sfo-lap-0074, lsys-sfo-lap-0085, lsys-sfo-lap-0096, lsys-sgp-lap-0076, lsys-sgp-lap-0077</w:t>
+            </w:r>
+          </w:p>
+        </w:tc>
+      </w:tr>
+      <w:tr>
+        <w:tc>
+          <w:tcPr>
+            <w:tcW w:type="dxa" w:w="1984"/>
+            <w:shd w:fill="EBF3FB" w:color="auto" w:val="clear"/>
+          </w:tcPr>
+          <w:p>
+            <w:r>
+              <w:rPr>
+                <w:b/>
+                <w:color w:val="0D2B4E"/>
+                <w:sz w:val="18"/>
+              </w:rPr>
+              <w:t>Mocks rebuilt</w:t>
+            </w:r>
+          </w:p>
+        </w:tc>
+        <w:tc>
+          <w:tcPr>
+            <w:tcW w:type="dxa" w:w="5953"/>
+          </w:tcPr>
+          <w:p>
+            <w:r>
+              <w:rPr>
+                <w:sz w:val="18"/>
+              </w:rPr>
+              <w:t>mock-crowdstrike-api, mock-intune-api, mock-servicenow-v2-api</w:t>
+            </w:r>
+          </w:p>
+        </w:tc>
+      </w:tr>
+      <w:tr>
+        <w:tc>
+          <w:tcPr>
+            <w:tcW w:type="dxa" w:w="1984"/>
+            <w:shd w:fill="EBF3FB" w:color="auto" w:val="clear"/>
+          </w:tcPr>
+          <w:p>
+            <w:r>
+              <w:rPr>
+                <w:b/>
+                <w:color w:val="0D2B4E"/>
+                <w:sz w:val="18"/>
+              </w:rPr>
+              <w:t>Deployed</w:t>
+            </w:r>
+          </w:p>
+        </w:tc>
+        <w:tc>
+          <w:tcPr>
+            <w:tcW w:type="dxa" w:w="5953"/>
+          </w:tcPr>
+          <w:p>
+            <w:r>
+              <w:rPr>
+                <w:sz w:val="18"/>
+              </w:rPr>
+              <w:t>2026-07-04 — ECR push → App Runner auto-deploy (all 3 RUNNING)</w:t>
+            </w:r>
+          </w:p>
+        </w:tc>
+      </w:tr>
+      <w:tr>
+        <w:tc>
+          <w:tcPr>
+            <w:tcW w:type="dxa" w:w="7937"/>
+            <w:gridSpan w:val="2"/>
+            <w:shd w:fill="FFFFFF" w:color="auto" w:val="clear"/>
+          </w:tcPr>
+          <w:p/>
+        </w:tc>
+      </w:tr>
     </w:tbl>
     <w:p/>
     <w:p>

</xml_diff>

<commit_message>
Rebuild tracker doc with SCENARIO vs CORRECTION structure
Replace FIX-001/002/003 naming with two distinct entry types:
- SCENARIO (purple) = intentional demo engineering (macOS 13.7 EOL)
- CORRECTION (teal) = genuine data bugs fixed (CS random OS, Win10 count 101→30)

Adds UAI Finding Status table, OS EOL landscape, and Blocked Findings section.

Co-Authored-By: Claude Sonnet 4.6 <noreply@anthropic.com>
</commit_message>
<xml_diff>
--- a/fixes/assets_of_interest_tracker.docx
+++ b/fixes/assets_of_interest_tracker.docx
@@ -3,9 +3,6 @@
 <w:document xmlns:wpc="http://schemas.microsoft.com/office/word/2010/wordprocessingCanvas" xmlns:mo="http://schemas.microsoft.com/office/mac/office/2008/main" xmlns:mc="http://schemas.openxmlformats.org/markup-compatibility/2006" xmlns:mv="urn:schemas-microsoft-com:mac:vml" xmlns:o="urn:schemas-microsoft-com:office:office" xmlns:r="http://schemas.openxmlformats.org/officeDocument/2006/relationships" xmlns:m="http://schemas.openxmlformats.org/officeDocument/2006/math" xmlns:v="urn:schemas-microsoft-com:vml" xmlns:wp14="http://schemas.microsoft.com/office/word/2010/wordprocessingDrawing" xmlns:wp="http://schemas.openxmlformats.org/drawingml/2006/wordprocessingDrawing" xmlns:w10="urn:schemas-microsoft-com:office:word" xmlns:w="http://schemas.openxmlformats.org/wordprocessingml/2006/main" xmlns:w14="http://schemas.microsoft.com/office/word/2010/wordml" xmlns:wpg="http://schemas.microsoft.com/office/word/2010/wordprocessingGroup" xmlns:wpi="http://schemas.microsoft.com/office/word/2010/wordprocessingInk" xmlns:wne="http://schemas.microsoft.com/office/word/2006/wordml" xmlns:wps="http://schemas.microsoft.com/office/word/2010/wordprocessingShape" mc:Ignorable="w14 wp14">
   <w:body>
     <w:p>
-      <w:pPr>
-        <w:jc w:val="left"/>
-      </w:pPr>
       <w:r>
         <w:rPr>
           <w:b/>
@@ -17,9 +14,6 @@
       </w:r>
     </w:p>
     <w:p>
-      <w:pPr>
-        <w:jc w:val="left"/>
-      </w:pPr>
       <w:r>
         <w:rPr>
           <w:b/>
@@ -27,7 +21,7 @@
           <w:color w:val="0D2B4E"/>
           <w:sz w:val="40"/>
         </w:rPr>
-        <w:t>Assets of Interest — Gap Tracker</w:t>
+        <w:t>Assets of Interest — Change Log</w:t>
       </w:r>
     </w:p>
     <w:p>
@@ -38,7 +32,7 @@
           <w:color w:val="444444"/>
           <w:sz w:val="20"/>
         </w:rPr>
-        <w:t>Tracks which of the 7 engineered UAI findings are live, which are in progress, and the exact changes made to the master sheet and mock generators to produce each one.</w:t>
+        <w:t>Tracks all intentional demo scenarios and data corrections applied to the mock stack. SCENARIO entries are deliberate — they engineer a UAI finding into the data. CORRECTION entries fix genuine bugs or data quality issues.</w:t>
       </w:r>
     </w:p>
     <w:p>
@@ -61,7 +55,7 @@
           <w:color w:val="0D2B4E"/>
           <w:sz w:val="26"/>
         </w:rPr>
-        <w:t>1. Status Dashboard</w:t>
+        <w:t>1. UAI Finding Status</w:t>
       </w:r>
     </w:p>
     <w:p/>
@@ -78,7 +72,7 @@
         <w:gridCol w:w="680"/>
         <w:gridCol w:w="1134"/>
         <w:gridCol w:w="2948"/>
-        <w:gridCol w:w="1247"/>
+        <w:gridCol w:w="1134"/>
       </w:tblGrid>
       <w:tr>
         <w:tc>
@@ -191,7 +185,7 @@
                 <w:color w:val="FFFFFF"/>
                 <w:sz w:val="18"/>
               </w:rPr>
-              <w:t>Date Fixed</w:t>
+              <w:t>Date</w:t>
             </w:r>
           </w:p>
         </w:tc>
@@ -668,7 +662,7 @@
               <w:rPr>
                 <w:sz w:val="18"/>
               </w:rPr>
-              <w:t>~43</w:t>
+              <w:t>~30</w:t>
             </w:r>
           </w:p>
         </w:tc>
@@ -704,7 +698,7 @@
               <w:rPr>
                 <w:sz w:val="18"/>
               </w:rPr>
-              <w:t>CrowdStrike, Tenable</w:t>
+              <w:t>CrowdStrike, Intune, ServiceNow</w:t>
             </w:r>
           </w:p>
         </w:tc>
@@ -721,7 +715,7 @@
               <w:rPr>
                 <w:sz w:val="18"/>
               </w:rPr>
-              <w:t>2026-07-01</w:t>
+              <w:t>2026-07-04</w:t>
             </w:r>
           </w:p>
         </w:tc>
@@ -782,7 +776,6 @@
           <w:tcPr>
             <w:tcW w:type="dxa" w:w="1624"/>
             <w:shd w:fill="1A7A4A" w:color="auto" w:val="clear"/>
-            <w:shd w:fill="1A7A4A" w:color="auto" w:val="clear"/>
           </w:tcPr>
           <w:p>
             <w:pPr>
@@ -794,14 +787,7 @@
                 <w:color w:val="FFFFFF"/>
                 <w:sz w:val="18"/>
               </w:rPr>
-            </w:r>
-            <w:r>
-              <w:rPr>
-                <w:b/>
-                <w:color w:val="FFFFFF"/>
-                <w:sz w:val="18"/>
-              </w:rPr>
-              <w:t>FIXED</w:t>
+              <w:t>READY</w:t>
             </w:r>
           </w:p>
         </w:tc>
@@ -835,12 +821,7 @@
               <w:rPr>
                 <w:sz w:val="18"/>
               </w:rPr>
-            </w:r>
-            <w:r>
-              <w:rPr>
-                <w:sz w:val="18"/>
-              </w:rPr>
-              <w:t>2026-07-04</w:t>
+              <w:t>2026-07-03</w:t>
             </w:r>
           </w:p>
         </w:tc>
@@ -971,7 +952,7 @@
           <w:i w:val="0"/>
           <w:sz w:val="20"/>
         </w:rPr>
-        <w:t>1,153 compute assets across 6 categories. Servers and VMs are 100% current. EOL risk concentrated in the laptop fleet.</w:t>
+        <w:t>1,153 compute assets. Servers and VMs are 100% current. EOL risk in laptops only.</w:t>
       </w:r>
     </w:p>
     <w:p/>
@@ -1204,7 +1185,7 @@
               <w:rPr>
                 <w:sz w:val="18"/>
               </w:rPr>
-              <w:t>182</w:t>
+              <w:t xml:space="preserve"> 30</w:t>
             </w:r>
           </w:p>
         </w:tc>
@@ -1864,7 +1845,7 @@
               <w:rPr>
                 <w:sz w:val="18"/>
               </w:rPr>
-              <w:t>2026</w:t>
+              <w:t>—</w:t>
             </w:r>
           </w:p>
         </w:tc>
@@ -2133,24 +2114,6 @@
         </w:tc>
       </w:tr>
     </w:tbl>
-    <w:p>
-      <w:r>
-        <w:rPr>
-          <w:b/>
-          <w:i w:val="0"/>
-          <w:sz w:val="20"/>
-        </w:rPr>
-        <w:t xml:space="preserve">EOL totals: </w:t>
-      </w:r>
-      <w:r>
-        <w:rPr>
-          <w:b w:val="0"/>
-          <w:i w:val="0"/>
-          <w:sz w:val="20"/>
-        </w:rPr>
-        <w:t>200 laptops (22% of laptop fleet) + 19 linux_ws (Fedora 41) = 219 EOL compute assets.</w:t>
-      </w:r>
-    </w:p>
     <w:p/>
     <w:p>
       <w:r>
@@ -2160,9 +2123,62 @@
           <w:color w:val="0D2B4E"/>
           <w:sz w:val="26"/>
         </w:rPr>
-        <w:t>3. Fix Log</w:t>
+        <w:t>3. Change Log</w:t>
       </w:r>
     </w:p>
+    <w:p>
+      <w:r>
+        <w:rPr>
+          <w:b/>
+          <w:i w:val="0"/>
+          <w:color w:val="4A0072"/>
+        </w:rPr>
+        <w:t xml:space="preserve">■ </w:t>
+      </w:r>
+      <w:r>
+        <w:rPr>
+          <w:b/>
+          <w:i w:val="0"/>
+          <w:color w:val="4A0072"/>
+          <w:sz w:val="18"/>
+        </w:rPr>
+        <w:t>SCENARIO</w:t>
+      </w:r>
+      <w:r>
+        <w:rPr>
+          <w:b w:val="0"/>
+          <w:i w:val="0"/>
+          <w:sz w:val="18"/>
+        </w:rPr>
+        <w:t xml:space="preserve">  — intentionally engineered to surface a UAI finding          </w:t>
+      </w:r>
+      <w:r>
+        <w:rPr>
+          <w:b/>
+          <w:i w:val="0"/>
+          <w:color w:val="005B6E"/>
+        </w:rPr>
+        <w:t xml:space="preserve">■ </w:t>
+      </w:r>
+      <w:r>
+        <w:rPr>
+          <w:b/>
+          <w:i w:val="0"/>
+          <w:color w:val="005B6E"/>
+          <w:sz w:val="18"/>
+        </w:rPr>
+        <w:t>CORRECTION</w:t>
+      </w:r>
+      <w:r>
+        <w:rPr>
+          <w:b w:val="0"/>
+          <w:i w:val="0"/>
+          <w:sz w:val="18"/>
+        </w:rPr>
+        <w:t xml:space="preserve">  — genuine data bug or quality issue resolved</w:t>
+      </w:r>
+    </w:p>
+    <w:p/>
     <w:tbl>
       <w:tblPr>
         <w:tblStyle w:val="TableGrid"/>
@@ -2178,7 +2194,7 @@
           <w:tcPr>
             <w:tcW w:type="dxa" w:w="7937"/>
             <w:gridSpan w:val="2"/>
-            <w:shd w:fill="005B9A" w:color="auto" w:val="clear"/>
+            <w:shd w:fill="4A0072" w:color="auto" w:val="clear"/>
           </w:tcPr>
           <w:p>
             <w:r>
@@ -2187,7 +2203,15 @@
                 <w:color w:val="FFFFFF"/>
                 <w:sz w:val="20"/>
               </w:rPr>
-              <w:t>FIX-001  ·  macOS Ventura 13 (EOL) — Finding #6  ·  2026-07-03</w:t>
+              <w:t xml:space="preserve">[SCENARIO]  </w:t>
+            </w:r>
+            <w:r>
+              <w:rPr>
+                <w:b/>
+                <w:color w:val="FFFFFF"/>
+                <w:sz w:val="20"/>
+              </w:rPr>
+              <w:t>SCENARIO-001  ·  macOS Ventura 13 EOL — UAI Finding #6  ·  2026-07-03</w:t>
             </w:r>
           </w:p>
         </w:tc>
@@ -2196,13 +2220,13 @@
         <w:tc>
           <w:tcPr>
             <w:tcW w:type="dxa" w:w="1984"/>
-            <w:shd w:fill="EBF3FB" w:color="auto" w:val="clear"/>
+            <w:shd w:fill="F9F0FF" w:color="auto" w:val="clear"/>
           </w:tcPr>
           <w:p>
             <w:r>
               <w:rPr>
                 <w:b/>
-                <w:color w:val="0D2B4E"/>
+                <w:color w:val="4A0072"/>
                 <w:sz w:val="18"/>
               </w:rPr>
               <w:t>Problem</w:t>
@@ -2212,13 +2236,14 @@
         <w:tc>
           <w:tcPr>
             <w:tcW w:type="dxa" w:w="5953"/>
+            <w:shd w:fill="FFFFFF" w:color="auto" w:val="clear"/>
           </w:tcPr>
           <w:p>
             <w:r>
               <w:rPr>
                 <w:sz w:val="18"/>
               </w:rPr>
-              <w:t>Zero mac_laptop rows had macOS 13.x. The finding could not surface in UAI because Jamf and CrowdStrike both reported current OS versions only.</w:t>
+              <w:t>Zero mac_laptop rows had macOS 13.x. The finding could not surface in UAI because Jamf and CrowdStrike both reported only current OS versions.</w:t>
             </w:r>
           </w:p>
         </w:tc>
@@ -2227,29 +2252,32 @@
         <w:tc>
           <w:tcPr>
             <w:tcW w:type="dxa" w:w="1984"/>
-            <w:shd w:fill="EBF3FB" w:color="auto" w:val="clear"/>
+            <w:shd w:fill="F9F0FF" w:color="auto" w:val="clear"/>
           </w:tcPr>
           <w:p>
             <w:r>
               <w:rPr>
                 <w:b/>
-                <w:color w:val="0D2B4E"/>
+                <w:color w:val="4A0072"/>
                 <w:sz w:val="18"/>
               </w:rPr>
-              <w:t>Fix applied</w:t>
+              <w:t>Applied</w:t>
             </w:r>
           </w:p>
         </w:tc>
         <w:tc>
           <w:tcPr>
             <w:tcW w:type="dxa" w:w="5953"/>
+            <w:shd w:fill="FFFFFF" w:color="auto" w:val="clear"/>
           </w:tcPr>
           <w:p>
             <w:r>
               <w:rPr>
                 <w:sz w:val="18"/>
               </w:rPr>
-              <w:t>18 mac_laptop rows updated in assets_luminary.xlsx — 3 per site (BLR, AMS, SGP, SFO, NYC, LON), all with jamf + crowdstrike in seen_by. OS changed from macOS 14.7 / 15.1 / 15.6 → macOS 13.7.</w:t>
+              <w:t>18 mac_laptop rows updated in assets_luminary.xlsx — 3 per site (BLR/AMS/SGP/SFO/NYC/LON), all with jamf + crowdstrike in seen_by.</w:t>
+              <w:br/>
+              <w:t>OS changed from macOS 14.7 / 15.1 / 15.6 → macOS 13.7.</w:t>
             </w:r>
           </w:p>
         </w:tc>
@@ -2258,39 +2286,40 @@
         <w:tc>
           <w:tcPr>
             <w:tcW w:type="dxa" w:w="1984"/>
-            <w:shd w:fill="EBF3FB" w:color="auto" w:val="clear"/>
+            <w:shd w:fill="F9F0FF" w:color="auto" w:val="clear"/>
           </w:tcPr>
           <w:p>
             <w:r>
               <w:rPr>
                 <w:b/>
-                <w:color w:val="0D2B4E"/>
+                <w:color w:val="4A0072"/>
                 <w:sz w:val="18"/>
               </w:rPr>
-              <w:t>Revert list</w:t>
+              <w:t>Revert to</w:t>
             </w:r>
           </w:p>
         </w:tc>
         <w:tc>
           <w:tcPr>
             <w:tcW w:type="dxa" w:w="5953"/>
+            <w:shd w:fill="FFFFFF" w:color="auto" w:val="clear"/>
           </w:tcPr>
           <w:p>
             <w:r>
               <w:rPr>
                 <w:sz w:val="18"/>
               </w:rPr>
-              <w:t>AMS: lsys-ams-lap-0552 (14.7), lsys-ams-lap-0568 (14.7), lsys-ams-lap-0609 (15.6)</w:t>
+              <w:t>AMS: lsys-ams-lap-0552 (→14.7), lsys-ams-lap-0568 (→14.7), lsys-ams-lap-0609 (→15.6)</w:t>
               <w:br/>
-              <w:t>BLR: lsys-blr-lap-0556 (15.6), lsys-blr-lap-0606 (14.7), lsys-blr-lap-0619 (15.6)</w:t>
+              <w:t>BLR: lsys-blr-lap-0556 (→15.6), lsys-blr-lap-0606 (→14.7), lsys-blr-lap-0619 (→15.6)</w:t>
               <w:br/>
-              <w:t>LON: lsys-lon-lap-0551 (15.1), lsys-lon-lap-0573 (15.1), lsys-lon-lap-0591 (15.1)</w:t>
+              <w:t>LON: lsys-lon-lap-0551 (→15.1), lsys-lon-lap-0573 (→15.1), lsys-lon-lap-0591 (→15.1)</w:t>
               <w:br/>
-              <w:t>NYC: lsys-nyc-lap-0558 (15.1), lsys-nyc-lap-0565 (15.6), lsys-nyc-lap-0574 (15.1)</w:t>
+              <w:t>NYC: lsys-nyc-lap-0558 (→15.1), lsys-nyc-lap-0565 (→15.6), lsys-nyc-lap-0574 (→15.1)</w:t>
               <w:br/>
-              <w:t>SFO: lsys-sfo-lap-0554 (15.1), lsys-sfo-lap-0563 (15.6), lsys-sfo-lap-0572 (15.1)</w:t>
+              <w:t>SFO: lsys-sfo-lap-0554 (→15.1), lsys-sfo-lap-0563 (→15.6), lsys-sfo-lap-0572 (→15.1)</w:t>
               <w:br/>
-              <w:t>SGP: lsys-sgp-lap-0549 (15.1), lsys-sgp-lap-0566 (15.6), lsys-sgp-lap-0580 (15.6)</w:t>
+              <w:t>SGP: lsys-sgp-lap-0549 (→15.1), lsys-sgp-lap-0566 (→15.6), lsys-sgp-lap-0580 (→15.6)</w:t>
             </w:r>
           </w:p>
         </w:tc>
@@ -2299,13 +2328,13 @@
         <w:tc>
           <w:tcPr>
             <w:tcW w:type="dxa" w:w="1984"/>
-            <w:shd w:fill="EBF3FB" w:color="auto" w:val="clear"/>
+            <w:shd w:fill="F9F0FF" w:color="auto" w:val="clear"/>
           </w:tcPr>
           <w:p>
             <w:r>
               <w:rPr>
                 <w:b/>
-                <w:color w:val="0D2B4E"/>
+                <w:color w:val="4A0072"/>
                 <w:sz w:val="18"/>
               </w:rPr>
               <w:t>Mocks rebuilt</w:t>
@@ -2315,6 +2344,7 @@
         <w:tc>
           <w:tcPr>
             <w:tcW w:type="dxa" w:w="5953"/>
+            <w:shd w:fill="FFFFFF" w:color="auto" w:val="clear"/>
           </w:tcPr>
           <w:p>
             <w:r>
@@ -2330,13 +2360,13 @@
         <w:tc>
           <w:tcPr>
             <w:tcW w:type="dxa" w:w="1984"/>
-            <w:shd w:fill="EBF3FB" w:color="auto" w:val="clear"/>
+            <w:shd w:fill="F9F0FF" w:color="auto" w:val="clear"/>
           </w:tcPr>
           <w:p>
             <w:r>
               <w:rPr>
                 <w:b/>
-                <w:color w:val="0D2B4E"/>
+                <w:color w:val="4A0072"/>
                 <w:sz w:val="18"/>
               </w:rPr>
               <w:t>Deployed</w:t>
@@ -2346,205 +2376,14 @@
         <w:tc>
           <w:tcPr>
             <w:tcW w:type="dxa" w:w="5953"/>
+            <w:shd w:fill="FFFFFF" w:color="auto" w:val="clear"/>
           </w:tcPr>
           <w:p>
             <w:r>
               <w:rPr>
                 <w:sz w:val="18"/>
               </w:rPr>
-              <w:t>2026-07-03 — ECR push → App Runner auto-deploy (both RUNNING)</w:t>
-            </w:r>
-          </w:p>
-        </w:tc>
-      </w:tr>
-      <w:tr>
-        <w:tc>
-          <w:tcPr>
-            <w:tcW w:type="dxa" w:w="7937"/>
-            <w:gridSpan w:val="2"/>
-            <w:shd w:fill="FFFFFF" w:color="auto" w:val="clear"/>
-          </w:tcPr>
-          <w:p>
-            <w:r/>
-          </w:p>
-        </w:tc>
-      </w:tr>
-      <w:tr>
-        <w:tc>
-          <w:tcPr>
-            <w:tcW w:type="dxa" w:w="7937"/>
-            <w:gridSpan w:val="2"/>
-            <w:shd w:fill="005B9A" w:color="auto" w:val="clear"/>
-          </w:tcPr>
-          <w:p>
-            <w:r>
-              <w:rPr>
-                <w:b/>
-                <w:color w:val="FFFFFF"/>
-                <w:sz w:val="20"/>
-              </w:rPr>
-              <w:t>FIX-002  ·  Windows 10 EOL cross-provider OS mismatch — Finding #5  ·  2026-07-04</w:t>
-            </w:r>
-          </w:p>
-        </w:tc>
-      </w:tr>
-      <w:tr>
-        <w:tc>
-          <w:tcPr>
-            <w:tcW w:type="dxa" w:w="1984"/>
-            <w:shd w:fill="EBF3FB" w:color="auto" w:val="clear"/>
-          </w:tcPr>
-          <w:p>
-            <w:r>
-              <w:rPr>
-                <w:b/>
-                <w:color w:val="0D2B4E"/>
-                <w:sz w:val="18"/>
-              </w:rPr>
-              <w:t>Problem</w:t>
-            </w:r>
-          </w:p>
-        </w:tc>
-        <w:tc>
-          <w:tcPr>
-            <w:tcW w:type="dxa" w:w="5953"/>
-          </w:tcPr>
-          <w:p>
-            <w:r>
-              <w:rPr>
-                <w:sz w:val="18"/>
-              </w:rPr>
-              <w:t>CrowdStrike generator contained win11 = random.random() &lt; 0.65 — meaning 65% of all Windows workstations were randomly assigned Windows 11 regardless of the xlsx os value. With random.seed(4406) this was deterministic but wrong. Win10 rows in the xlsx appeared as Win11 in CrowdStrike, while Intune and ServiceNow correctly showed Win10 — causing a cross-provider OS mismatch visible in the CSP unified asset view.</w:t>
-            </w:r>
-          </w:p>
-        </w:tc>
-      </w:tr>
-      <w:tr>
-        <w:tc>
-          <w:tcPr>
-            <w:tcW w:type="dxa" w:w="1984"/>
-            <w:shd w:fill="EBF3FB" w:color="auto" w:val="clear"/>
-          </w:tcPr>
-          <w:p>
-            <w:r>
-              <w:rPr>
-                <w:b/>
-                <w:color w:val="0D2B4E"/>
-                <w:sz w:val="18"/>
-              </w:rPr>
-              <w:t>Fix applied</w:t>
-            </w:r>
-          </w:p>
-        </w:tc>
-        <w:tc>
-          <w:tcPr>
-            <w:tcW w:type="dxa" w:w="5953"/>
-          </w:tcPr>
-          <w:p>
-            <w:r>
-              <w:rPr>
-                <w:sz w:val="18"/>
-              </w:rPr>
-              <w:t>One-line fix in mock-crowdstrike-api/seed_data/generate_cs_data.py:</w:t>
-              <w:br/>
-              <w:t xml:space="preserve">  Before: win11 = random.random() &lt; 0.65</w:t>
-              <w:br/>
-              <w:t xml:space="preserve">  After:  win11 = "11" in o</w:t>
-              <w:br/>
-              <w:t>Intune and ServiceNow were already clean (read xlsx directly, no transformation). CrowdStrike seed data regenerated: 179 Win10 Pro + 17 Win10 Enterprise now match the xlsx (182 total, minus ~3 without crowdstrike in seen_by).</w:t>
-            </w:r>
-          </w:p>
-        </w:tc>
-      </w:tr>
-      <w:tr>
-        <w:tc>
-          <w:tcPr>
-            <w:tcW w:type="dxa" w:w="1984"/>
-            <w:shd w:fill="EBF3FB" w:color="auto" w:val="clear"/>
-          </w:tcPr>
-          <w:p>
-            <w:r>
-              <w:rPr>
-                <w:b/>
-                <w:color w:val="0D2B4E"/>
-                <w:sz w:val="18"/>
-              </w:rPr>
-              <w:t>Revert</w:t>
-            </w:r>
-          </w:p>
-        </w:tc>
-        <w:tc>
-          <w:tcPr>
-            <w:tcW w:type="dxa" w:w="5953"/>
-          </w:tcPr>
-          <w:p>
-            <w:r>
-              <w:rPr>
-                <w:sz w:val="18"/>
-              </w:rPr>
-              <w:t>Revert generate_cs_data.py line ~194 to: win11 = random.random() &lt; 0.65</w:t>
-            </w:r>
-          </w:p>
-        </w:tc>
-      </w:tr>
-      <w:tr>
-        <w:tc>
-          <w:tcPr>
-            <w:tcW w:type="dxa" w:w="1984"/>
-            <w:shd w:fill="EBF3FB" w:color="auto" w:val="clear"/>
-          </w:tcPr>
-          <w:p>
-            <w:r>
-              <w:rPr>
-                <w:b/>
-                <w:color w:val="0D2B4E"/>
-                <w:sz w:val="18"/>
-              </w:rPr>
-              <w:t>Mocks rebuilt</w:t>
-            </w:r>
-          </w:p>
-        </w:tc>
-        <w:tc>
-          <w:tcPr>
-            <w:tcW w:type="dxa" w:w="5953"/>
-          </w:tcPr>
-          <w:p>
-            <w:r>
-              <w:rPr>
-                <w:sz w:val="18"/>
-              </w:rPr>
-              <w:t>mock-crowdstrike-api only (Intune + ServiceNow unaffected)</w:t>
-            </w:r>
-          </w:p>
-        </w:tc>
-      </w:tr>
-      <w:tr>
-        <w:tc>
-          <w:tcPr>
-            <w:tcW w:type="dxa" w:w="1984"/>
-            <w:shd w:fill="EBF3FB" w:color="auto" w:val="clear"/>
-          </w:tcPr>
-          <w:p>
-            <w:r>
-              <w:rPr>
-                <w:b/>
-                <w:color w:val="0D2B4E"/>
-                <w:sz w:val="18"/>
-              </w:rPr>
-              <w:t>Deployed</w:t>
-            </w:r>
-          </w:p>
-        </w:tc>
-        <w:tc>
-          <w:tcPr>
-            <w:tcW w:type="dxa" w:w="5953"/>
-          </w:tcPr>
-          <w:p>
-            <w:r>
-              <w:rPr>
-                <w:sz w:val="18"/>
-              </w:rPr>
-              <w:t>2026-07-04 — ECR push → App Runner auto-deploy (RUNNING)</w:t>
+              <w:t>2026-07-03 — ECR push → App Runner auto-deploy</w:t>
             </w:r>
           </w:p>
         </w:tc>
@@ -2564,7 +2403,7 @@
           <w:tcPr>
             <w:tcW w:type="dxa" w:w="7937"/>
             <w:gridSpan w:val="2"/>
-            <w:shd w:fill="005B9A" w:color="auto" w:val="clear"/>
+            <w:shd w:fill="005B6E" w:color="auto" w:val="clear"/>
           </w:tcPr>
           <w:p>
             <w:r>
@@ -2573,7 +2412,15 @@
                 <w:color w:val="FFFFFF"/>
                 <w:sz w:val="20"/>
               </w:rPr>
-              <w:t>FIX-003  ·  Windows 10 EOL — reduce to 30 demo assets, fix VDI random path  ·  2026-07-04</w:t>
+              <w:t xml:space="preserve">[CORRECTION]  </w:t>
+            </w:r>
+            <w:r>
+              <w:rPr>
+                <w:b/>
+                <w:color w:val="FFFFFF"/>
+                <w:sz w:val="20"/>
+              </w:rPr>
+              <w:t>CORRECTION-001  ·  CrowdStrike Win10/Win11 random OS mismatch  ·  2026-07-04</w:t>
             </w:r>
           </w:p>
         </w:tc>
@@ -2582,13 +2429,13 @@
         <w:tc>
           <w:tcPr>
             <w:tcW w:type="dxa" w:w="1984"/>
-            <w:shd w:fill="EBF3FB" w:color="auto" w:val="clear"/>
+            <w:shd w:fill="F0FAFC" w:color="auto" w:val="clear"/>
           </w:tcPr>
           <w:p>
             <w:r>
               <w:rPr>
                 <w:b/>
-                <w:color w:val="0D2B4E"/>
+                <w:color w:val="005B6E"/>
                 <w:sz w:val="18"/>
               </w:rPr>
               <w:t>Problem</w:t>
@@ -2598,13 +2445,14 @@
         <w:tc>
           <w:tcPr>
             <w:tcW w:type="dxa" w:w="5953"/>
+            <w:shd w:fill="FFFFFF" w:color="auto" w:val="clear"/>
           </w:tcPr>
           <w:p>
             <w:r>
               <w:rPr>
                 <w:sz w:val="18"/>
               </w:rPr>
-              <w:t>CSP showed 101 Windows 10 assets after re-sync. Target was ~25-30 for the demo. 182 win_laptop rows had os="Windows 10 Pro" in xlsx; additionally 15 VDI rows had os="Windows 10 Pro" and the CrowdStrike VDI path had the same random.random() &lt; 0.6 bug as the workstation path (fixed in FIX-002 for laptops but missed for VDI).</w:t>
+              <w:t>CrowdStrike generator had win11 = random.random() &lt; 0.65 (workstations) and &lt; 0.60 (VDI). ~65% of Win10 xlsx rows reported as Windows 11 by CrowdStrike only. Intune and ServiceNow correctly showed Win10 — causing a cross-provider OS mismatch in CSP.</w:t>
             </w:r>
           </w:p>
         </w:tc>
@@ -2613,35 +2461,36 @@
         <w:tc>
           <w:tcPr>
             <w:tcW w:type="dxa" w:w="1984"/>
-            <w:shd w:fill="EBF3FB" w:color="auto" w:val="clear"/>
+            <w:shd w:fill="F0FAFC" w:color="auto" w:val="clear"/>
           </w:tcPr>
           <w:p>
             <w:r>
               <w:rPr>
                 <w:b/>
-                <w:color w:val="0D2B4E"/>
+                <w:color w:val="005B6E"/>
                 <w:sz w:val="18"/>
               </w:rPr>
-              <w:t>Fix applied</w:t>
+              <w:t>Applied</w:t>
             </w:r>
           </w:p>
         </w:tc>
         <w:tc>
           <w:tcPr>
             <w:tcW w:type="dxa" w:w="5953"/>
+            <w:shd w:fill="FFFFFF" w:color="auto" w:val="clear"/>
           </w:tcPr>
           <w:p>
             <w:r>
               <w:rPr>
                 <w:sz w:val="18"/>
               </w:rPr>
-              <w:t>1. assets_luminary.xlsx — 152 win_laptop rows changed from "Windows 10 Pro" → "Windows 11 Pro" (kept 30 proportionally: SFO=11, BLR=5, LON=5, AMS=4, NYC=3, SGP=2).</w:t>
+              <w:t>generate_cs_data.py — two lines fixed:</w:t>
               <w:br/>
-              <w:t>2. assets_luminary.xlsx — 15 vdi rows changed from "Windows 10 Pro" → "Windows 11 Enterprise".</w:t>
+              <w:t xml:space="preserve">  Workstation: win11 = random.random() &lt; 0.65  →  win11 = "11" in o</w:t>
               <w:br/>
-              <w:t>3. generate_cs_data.py VDI path: win11 = random.random() &lt; 0.6 → win11 = "11" in o.</w:t>
+              <w:t xml:space="preserve">  VDI:         win11 = random.random() &lt; 0.60  →  win11 = "11" in o</w:t>
               <w:br/>
-              <w:t>CrowdStrike, Intune, ServiceNow seed data regenerated. CS result: 29 Windows 10 Pro workstations (1 of 30 lacks CS in seen_by, still surfaces via Intune/ServiceNow).</w:t>
+              <w:t>All three providers now agree on OS version for every device.</w:t>
             </w:r>
           </w:p>
         </w:tc>
@@ -2650,29 +2499,34 @@
         <w:tc>
           <w:tcPr>
             <w:tcW w:type="dxa" w:w="1984"/>
-            <w:shd w:fill="EBF3FB" w:color="auto" w:val="clear"/>
+            <w:shd w:fill="F0FAFC" w:color="auto" w:val="clear"/>
           </w:tcPr>
           <w:p>
             <w:r>
               <w:rPr>
                 <w:b/>
-                <w:color w:val="0D2B4E"/>
+                <w:color w:val="005B6E"/>
                 <w:sz w:val="18"/>
               </w:rPr>
-              <w:t>30 demo assets</w:t>
+              <w:t>Revert to</w:t>
             </w:r>
           </w:p>
         </w:tc>
         <w:tc>
           <w:tcPr>
             <w:tcW w:type="dxa" w:w="5953"/>
+            <w:shd w:fill="FFFFFF" w:color="auto" w:val="clear"/>
           </w:tcPr>
           <w:p>
             <w:r>
               <w:rPr>
                 <w:sz w:val="18"/>
               </w:rPr>
-              <w:t>lsys-ams-lap-0004, lsys-ams-lap-0017, lsys-ams-lap-0024, lsys-ams-lap-0051, lsys-blr-lap-0011, lsys-blr-lap-0027, lsys-blr-lap-0065, lsys-blr-lap-0087, lsys-blr-lap-0088, lsys-lon-lap-0033, lsys-lon-lap-0038, lsys-lon-lap-0045, lsys-lon-lap-0048, lsys-lon-lap-0075, lsys-nyc-lap-0015, lsys-nyc-lap-0044, lsys-nyc-lap-0053, lsys-sfo-lap-0007, lsys-sfo-lap-0020, lsys-sfo-lap-0022, lsys-sfo-lap-0031, lsys-sfo-lap-0039, lsys-sfo-lap-0047, lsys-sfo-lap-0066, lsys-sfo-lap-0072, lsys-sfo-lap-0074, lsys-sfo-lap-0085, lsys-sfo-lap-0096, lsys-sgp-lap-0076, lsys-sgp-lap-0077</w:t>
+              <w:t>Revert generate_cs_data.py:</w:t>
+              <w:br/>
+              <w:t xml:space="preserve">  Workstation line (~194): win11 = random.random() &lt; 0.65</w:t>
+              <w:br/>
+              <w:t xml:space="preserve">  VDI line (~181):         win11 = random.random() &lt; 0.60</w:t>
             </w:r>
           </w:p>
         </w:tc>
@@ -2681,31 +2535,199 @@
         <w:tc>
           <w:tcPr>
             <w:tcW w:type="dxa" w:w="1984"/>
-            <w:shd w:fill="EBF3FB" w:color="auto" w:val="clear"/>
+            <w:shd w:fill="F0FAFC" w:color="auto" w:val="clear"/>
           </w:tcPr>
           <w:p>
             <w:r>
               <w:rPr>
                 <w:b/>
-                <w:color w:val="0D2B4E"/>
+                <w:color w:val="005B6E"/>
                 <w:sz w:val="18"/>
               </w:rPr>
-              <w:t>Revert</w:t>
+              <w:t>Mocks rebuilt</w:t>
             </w:r>
           </w:p>
         </w:tc>
         <w:tc>
           <w:tcPr>
             <w:tcW w:type="dxa" w:w="5953"/>
+            <w:shd w:fill="FFFFFF" w:color="auto" w:val="clear"/>
           </w:tcPr>
           <w:p>
             <w:r>
               <w:rPr>
                 <w:sz w:val="18"/>
               </w:rPr>
-              <w:t>In xlsx, set os="Windows 10 Pro" for these 30 hostnames (and "Windows 10 Pro" for the 15 VDI rows lsys-*-vdi-*). Revert generate_cs_data.py VDI line to: win11 = random.random() &lt; 0.6</w:t>
+              <w:t>mock-crowdstrike-api</w:t>
+            </w:r>
+          </w:p>
+        </w:tc>
+      </w:tr>
+      <w:tr>
+        <w:tc>
+          <w:tcPr>
+            <w:tcW w:type="dxa" w:w="1984"/>
+            <w:shd w:fill="F0FAFC" w:color="auto" w:val="clear"/>
+          </w:tcPr>
+          <w:p>
+            <w:r>
+              <w:rPr>
+                <w:b/>
+                <w:color w:val="005B6E"/>
+                <w:sz w:val="18"/>
+              </w:rPr>
+              <w:t>Deployed</w:t>
+            </w:r>
+          </w:p>
+        </w:tc>
+        <w:tc>
+          <w:tcPr>
+            <w:tcW w:type="dxa" w:w="5953"/>
+            <w:shd w:fill="FFFFFF" w:color="auto" w:val="clear"/>
+          </w:tcPr>
+          <w:p>
+            <w:r>
+              <w:rPr>
+                <w:sz w:val="18"/>
+              </w:rPr>
+              <w:t>2026-07-04 — ECR push → App Runner auto-deploy</w:t>
+            </w:r>
+          </w:p>
+        </w:tc>
+      </w:tr>
+      <w:tr>
+        <w:tc>
+          <w:tcPr>
+            <w:tcW w:type="dxa" w:w="7937"/>
+            <w:gridSpan w:val="2"/>
+            <w:shd w:fill="FFFFFF" w:color="auto" w:val="clear"/>
+          </w:tcPr>
+          <w:p/>
+        </w:tc>
+      </w:tr>
+      <w:tr>
+        <w:tc>
+          <w:tcPr>
+            <w:tcW w:type="dxa" w:w="7937"/>
+            <w:gridSpan w:val="2"/>
+            <w:shd w:fill="005B6E" w:color="auto" w:val="clear"/>
+          </w:tcPr>
+          <w:p>
+            <w:r>
+              <w:rPr>
+                <w:b/>
+                <w:color w:val="FFFFFF"/>
+                <w:sz w:val="20"/>
+              </w:rPr>
+              <w:t xml:space="preserve">[CORRECTION]  </w:t>
+            </w:r>
+            <w:r>
+              <w:rPr>
+                <w:b/>
+                <w:color w:val="FFFFFF"/>
+                <w:sz w:val="20"/>
+              </w:rPr>
+              <w:t>CORRECTION-002  ·  Windows 10 EOL count reduced 101 → 30 demo assets  ·  2026-07-04</w:t>
+            </w:r>
+          </w:p>
+        </w:tc>
+      </w:tr>
+      <w:tr>
+        <w:tc>
+          <w:tcPr>
+            <w:tcW w:type="dxa" w:w="1984"/>
+            <w:shd w:fill="F0FAFC" w:color="auto" w:val="clear"/>
+          </w:tcPr>
+          <w:p>
+            <w:r>
+              <w:rPr>
+                <w:b/>
+                <w:color w:val="005B6E"/>
+                <w:sz w:val="18"/>
+              </w:rPr>
+              <w:t>Problem</w:t>
+            </w:r>
+          </w:p>
+        </w:tc>
+        <w:tc>
+          <w:tcPr>
+            <w:tcW w:type="dxa" w:w="5953"/>
+            <w:shd w:fill="FFFFFF" w:color="auto" w:val="clear"/>
+          </w:tcPr>
+          <w:p>
+            <w:r>
+              <w:rPr>
+                <w:sz w:val="18"/>
+              </w:rPr>
+              <w:t>CSP showed 101 Windows 10 assets after re-sync. Target was ~25-30. 182 win_laptop rows + 15 VDI rows had os="Windows 10 Pro" in xlsx. The VDI random bug (CORRECTION-001) was also contributing to the inflated count.</w:t>
+            </w:r>
+          </w:p>
+        </w:tc>
+      </w:tr>
+      <w:tr>
+        <w:tc>
+          <w:tcPr>
+            <w:tcW w:type="dxa" w:w="1984"/>
+            <w:shd w:fill="F0FAFC" w:color="auto" w:val="clear"/>
+          </w:tcPr>
+          <w:p>
+            <w:r>
+              <w:rPr>
+                <w:b/>
+                <w:color w:val="005B6E"/>
+                <w:sz w:val="18"/>
+              </w:rPr>
+              <w:t>Applied</w:t>
+            </w:r>
+          </w:p>
+        </w:tc>
+        <w:tc>
+          <w:tcPr>
+            <w:tcW w:type="dxa" w:w="5953"/>
+            <w:shd w:fill="FFFFFF" w:color="auto" w:val="clear"/>
+          </w:tcPr>
+          <w:p>
+            <w:r>
+              <w:rPr>
+                <w:sz w:val="18"/>
+              </w:rPr>
+              <w:t>152 win_laptop rows: "Windows 10 Pro" → "Windows 11 Pro" (30 kept: SFO=11, BLR=5, LON=5, AMS=4, NYC=3, SGP=2).</w:t>
               <w:br/>
-              <w:t>Kept hostnames:</w:t>
+              <w:t>15 vdi rows: "Windows 10 Pro" → "Windows 11 Enterprise".</w:t>
+              <w:br/>
+              <w:t>CrowdStrike seed now shows 29 Win10 Pro workstations (1 of 30 lacks CS in seen_by, surfaces via Intune/ServiceNow).</w:t>
+            </w:r>
+          </w:p>
+        </w:tc>
+      </w:tr>
+      <w:tr>
+        <w:tc>
+          <w:tcPr>
+            <w:tcW w:type="dxa" w:w="1984"/>
+            <w:shd w:fill="F0FAFC" w:color="auto" w:val="clear"/>
+          </w:tcPr>
+          <w:p>
+            <w:r>
+              <w:rPr>
+                <w:b/>
+                <w:color w:val="005B6E"/>
+                <w:sz w:val="18"/>
+              </w:rPr>
+              <w:t>Revert to</w:t>
+            </w:r>
+          </w:p>
+        </w:tc>
+        <w:tc>
+          <w:tcPr>
+            <w:tcW w:type="dxa" w:w="5953"/>
+            <w:shd w:fill="FFFFFF" w:color="auto" w:val="clear"/>
+          </w:tcPr>
+          <w:p>
+            <w:r>
+              <w:rPr>
+                <w:sz w:val="18"/>
+              </w:rPr>
+              <w:t>Set os="Windows 10 Pro" for these 30 win_laptop hostnames:</w:t>
               <w:br/>
               <w:t>lsys-ams-lap-0004, lsys-ams-lap-0017, lsys-ams-lap-0024, lsys-ams-lap-0051, lsys-blr-lap-0011, lsys-blr-lap-0027, lsys-blr-lap-0065, lsys-blr-lap-0087, lsys-blr-lap-0088, lsys-lon-lap-0033, lsys-lon-lap-0038, lsys-lon-lap-0045, lsys-lon-lap-0048, lsys-lon-lap-0075, lsys-nyc-lap-0015, lsys-nyc-lap-0044, lsys-nyc-lap-0053, lsys-sfo-lap-0007, lsys-sfo-lap-0020, lsys-sfo-lap-0022, lsys-sfo-lap-0031, lsys-sfo-lap-0039, lsys-sfo-lap-0047, lsys-sfo-lap-0066, lsys-sfo-lap-0072, lsys-sfo-lap-0074, lsys-sfo-lap-0085, lsys-sfo-lap-0096, lsys-sgp-lap-0076, lsys-sgp-lap-0077</w:t>
             </w:r>
@@ -2716,13 +2738,13 @@
         <w:tc>
           <w:tcPr>
             <w:tcW w:type="dxa" w:w="1984"/>
-            <w:shd w:fill="EBF3FB" w:color="auto" w:val="clear"/>
+            <w:shd w:fill="F0FAFC" w:color="auto" w:val="clear"/>
           </w:tcPr>
           <w:p>
             <w:r>
               <w:rPr>
                 <w:b/>
-                <w:color w:val="0D2B4E"/>
+                <w:color w:val="005B6E"/>
                 <w:sz w:val="18"/>
               </w:rPr>
               <w:t>Mocks rebuilt</w:t>
@@ -2732,6 +2754,7 @@
         <w:tc>
           <w:tcPr>
             <w:tcW w:type="dxa" w:w="5953"/>
+            <w:shd w:fill="FFFFFF" w:color="auto" w:val="clear"/>
           </w:tcPr>
           <w:p>
             <w:r>
@@ -2747,13 +2770,13 @@
         <w:tc>
           <w:tcPr>
             <w:tcW w:type="dxa" w:w="1984"/>
-            <w:shd w:fill="EBF3FB" w:color="auto" w:val="clear"/>
+            <w:shd w:fill="F0FAFC" w:color="auto" w:val="clear"/>
           </w:tcPr>
           <w:p>
             <w:r>
               <w:rPr>
                 <w:b/>
-                <w:color w:val="0D2B4E"/>
+                <w:color w:val="005B6E"/>
                 <w:sz w:val="18"/>
               </w:rPr>
               <w:t>Deployed</w:t>
@@ -2763,13 +2786,14 @@
         <w:tc>
           <w:tcPr>
             <w:tcW w:type="dxa" w:w="5953"/>
+            <w:shd w:fill="FFFFFF" w:color="auto" w:val="clear"/>
           </w:tcPr>
           <w:p>
             <w:r>
               <w:rPr>
                 <w:sz w:val="18"/>
               </w:rPr>
-              <w:t>2026-07-04 — ECR push → App Runner auto-deploy (all 3 RUNNING)</w:t>
+              <w:t>2026-07-04 — ECR push → App Runner auto-deploy (all 3)</w:t>
             </w:r>
           </w:p>
         </w:tc>
@@ -2817,7 +2841,7 @@
           <w:i w:val="0"/>
           <w:sz w:val="18"/>
         </w:rPr>
-        <w:t>Currently 14 win_laptop rows lack CrowdStrike in seen_by. Need 8 more. Edit seen_by on 8 additional win_laptop rows to remove crowdstrike while keeping intune/tenable/mist/meraki.</w:t>
+        <w:t>14 win_laptop rows lack CrowdStrike in seen_by (target ~22). Edit seen_by on 8 more rows to remove crowdstrike while keeping intune/tenable/mist/meraki.</w:t>
       </w:r>
     </w:p>
     <w:p>
@@ -2840,7 +2864,7 @@
           <w:i w:val="0"/>
           <w:sz w:val="18"/>
         </w:rPr>
-        <w:t>Requires a new cmdb_os column in assets_luminary.xlsx (~32 rows with stale value e.g. "Windows 10 Pro" while os = "Windows 11 Pro"). ServiceNow generator must be updated to output cmdb_os instead of os for the CMDB CI operatingSystem field.</w:t>
+        <w:t>Add cmdb_os column to xlsx (~32 rows with stale value). Update ServiceNow generator to output cmdb_os for the CMDB CI operatingSystem field.</w:t>
       </w:r>
     </w:p>
     <w:p>
@@ -2863,7 +2887,7 @@
           <w:i w:val="0"/>
           <w:sz w:val="18"/>
         </w:rPr>
-        <w:t>Requires a new install_status column in assets_luminary.xlsx (~18 rows set to "Retired" or "In Stock"). ServiceNow generator must include install_status in CI output. Assets must still be seen by CrowdStrike/Tenable to create the contradiction.</w:t>
+        <w:t>Add install_status column to xlsx (~18 rows set to "Retired"/"In Stock"). Update ServiceNow generator to include field in CI output.</w:t>
       </w:r>
     </w:p>
     <w:p>
@@ -2886,7 +2910,7 @@
           <w:i w:val="0"/>
           <w:sz w:val="18"/>
         </w:rPr>
-        <w:t>Pick ~13 iot rows and set ip_address to a Corporate VLAN IP (e.g. 10.11.1.x for Meraki SFO, 10.10.1.x for Mist BLR). The Meraki generator already honours xlsx IPs. Mist generator may need a similar fix. Ordr must also report the same wrong-subnet IPs for UAI to surface the cross-source finding.</w:t>
+        <w:t>Pick ~13 iot rows, set ip_address to Corporate VLAN IP (e.g. 10.11.1.x for Meraki SFO). Ordr must report the same wrong-subnet IPs.</w:t>
       </w:r>
     </w:p>
     <w:p/>
@@ -2901,7 +2925,7 @@
           <w:color w:val="888888"/>
           <w:sz w:val="16"/>
         </w:rPr>
-        <w:t>This document is auto-maintained. Update each time a gap is fixed or a new finding is engineered.</w:t>
+        <w:t>SCENARIO = intentional demo engineering.  CORRECTION = data quality fix.  Update this log on every change.</w:t>
       </w:r>
     </w:p>
     <w:sectPr>

</xml_diff>

<commit_message>
Clean up tracker — remove talk track, add related-docs pointer
- Removed Talk Track table entirely (now lives in UAI_Integrations_Playbook.docx)
- Removed 17 trailing blank paragraphs left over from previous edit
- Added Related Documents note row at bottom of Finding Status table pointing to
  UAI_Integrations_Playbook.docx and Intune_Bugs.xlsx

Tracker now covers only what it should: AOI finding status, OS breakdown,
and the data change log (SCENARIO/CORRECTION/ENRICHMENT entries).

Co-Authored-By: Claude Sonnet 4.6 <noreply@anthropic.com>
</commit_message>
<xml_diff>
--- a/fixes/assets_of_interest_tracker.docx
+++ b/fixes/assets_of_interest_tracker.docx
@@ -950,6 +950,32 @@
           <w:p>
             <w:r>
               <w:t>2026-07-04</w:t>
+            </w:r>
+          </w:p>
+        </w:tc>
+      </w:tr>
+      <w:tr>
+        <w:tc>
+          <w:tcPr>
+            <w:tcW w:type="dxa" w:w="9962"/>
+            <w:gridSpan w:val="6"/>
+            <w:shd w:val="clear" w:color="auto" w:fill="EEF3F8"/>
+          </w:tcPr>
+          <w:p>
+            <w:r>
+              <w:rPr>
+                <w:b/>
+                <w:color w:val="1B3A5C"/>
+                <w:sz w:val="17"/>
+              </w:rPr>
+              <w:t xml:space="preserve">📁  Related Documents: </w:t>
+            </w:r>
+            <w:r>
+              <w:rPr>
+                <w:color w:val="37474F"/>
+                <w:sz w:val="17"/>
+              </w:rPr>
+              <w:t>SE Demo Guide → UAI_Integrations_Playbook.docx  ·  Intune Connector Bugs → Intune_Bugs.xlsx  (both in this folder)</w:t>
             </w:r>
           </w:p>
         </w:tc>
@@ -3442,1406 +3468,6 @@
             <w:gridSpan w:val="2"/>
           </w:tcPr>
           <w:p/>
-        </w:tc>
-      </w:tr>
-    </w:tbl>
-    <w:p/>
-    <w:p>
-      <w:r>
-        <w:rPr>
-          <w:b/>
-          <w:color w:val="0D2B4E"/>
-          <w:sz w:val="26"/>
-        </w:rPr>
-        <w:t>4. Blocked Findings — Required Work</w:t>
-      </w:r>
-    </w:p>
-    <w:p>
-      <w:pPr>
-        <w:pStyle w:val="ListBullet"/>
-      </w:pPr>
-      <w:r>
-        <w:rPr>
-          <w:b/>
-          <w:color w:val="C0392B"/>
-        </w:rPr>
-        <w:t>Finding #1 — Windows missing CrowdStrike (+8 rows)</w:t>
-      </w:r>
-      <w:r>
-        <w:rPr>
-          <w:b/>
-          <w:color w:val="C0392B"/>
-        </w:rPr>
-        <w:br/>
-      </w:r>
-      <w:r>
-        <w:rPr>
-          <w:sz w:val="18"/>
-        </w:rPr>
-        <w:t>14 win_laptop rows lack CrowdStrike in seen_by (target ~22). Edit seen_by on 8 more rows to remove crowdstrike while keeping intune/tenable/mist/meraki.</w:t>
-      </w:r>
-    </w:p>
-    <w:p>
-      <w:pPr>
-        <w:pStyle w:val="ListBullet"/>
-      </w:pPr>
-      <w:r>
-        <w:rPr>
-          <w:b/>
-          <w:color w:val="C0392B"/>
-        </w:rPr>
-        <w:t>Finding #3 — Wrong OS version in ServiceNow</w:t>
-      </w:r>
-      <w:r>
-        <w:rPr>
-          <w:b/>
-          <w:color w:val="C0392B"/>
-        </w:rPr>
-        <w:br/>
-      </w:r>
-      <w:r>
-        <w:rPr>
-          <w:sz w:val="18"/>
-        </w:rPr>
-        <w:t>Add cmdb_os column to xlsx (~32 rows with stale value). Update ServiceNow generator to output cmdb_os for the CMDB CI operatingSystem field.</w:t>
-      </w:r>
-    </w:p>
-    <w:p>
-      <w:pPr>
-        <w:pStyle w:val="ListBullet"/>
-      </w:pPr>
-      <w:r>
-        <w:rPr>
-          <w:b/>
-          <w:color w:val="C0392B"/>
-        </w:rPr>
-        <w:t>Finding #4 — Wrong install_status in ServiceNow</w:t>
-      </w:r>
-      <w:r>
-        <w:rPr>
-          <w:b/>
-          <w:color w:val="C0392B"/>
-        </w:rPr>
-        <w:br/>
-      </w:r>
-      <w:r>
-        <w:rPr>
-          <w:sz w:val="18"/>
-        </w:rPr>
-        <w:t>Add install_status column to xlsx (~18 rows set to "Retired"/"In Stock"). Update ServiceNow generator to include field in CI output.</w:t>
-      </w:r>
-    </w:p>
-    <w:p>
-      <w:pPr>
-        <w:pStyle w:val="ListBullet"/>
-      </w:pPr>
-      <w:r>
-        <w:rPr>
-          <w:b/>
-          <w:color w:val="C0392B"/>
-        </w:rPr>
-        <w:t>Finding #7 — IoT devices on the wrong subnet</w:t>
-      </w:r>
-      <w:r>
-        <w:rPr>
-          <w:b/>
-          <w:color w:val="C0392B"/>
-        </w:rPr>
-        <w:br/>
-      </w:r>
-      <w:r>
-        <w:rPr>
-          <w:sz w:val="18"/>
-        </w:rPr>
-        <w:t>Pick ~13 iot rows, set ip_address to Corporate VLAN IP (e.g. 10.11.1.x for Meraki SFO). Ordr must report the same wrong-subnet IPs.</w:t>
-      </w:r>
-    </w:p>
-    <w:p/>
-    <w:p>
-      <w:pPr>
-        <w:jc w:val="center"/>
-      </w:pPr>
-      <w:r>
-        <w:rPr>
-          <w:i/>
-          <w:color w:val="888888"/>
-          <w:sz w:val="16"/>
-        </w:rPr>
-        <w:t>SCENARIO = intentional demo engineering.  CORRECTION = data quality fix.  Update this log on every change.</w:t>
-      </w:r>
-    </w:p>
-    <w:p/>
-    <w:p/>
-    <w:p/>
-    <w:p/>
-    <w:p>
-      <w:r>
-        <w:rPr>
-          <w:b/>
-          <w:color w:val="0D2B4E"/>
-          <w:sz w:val="26"/>
-        </w:rPr>
-        <w:lastRenderedPageBreak/>
-        <w:t>5. Sales Talk Tracks — SE Demo Guide</w:t>
-      </w:r>
-    </w:p>
-    <w:p>
-      <w:r>
-        <w:rPr>
-          <w:color w:val="555555"/>
-          <w:sz w:val="18"/>
-        </w:rPr>
-        <w:t>Step-by-step demo scripts for Sales Engineers. Each entry covers setup, click path, what to say, discovery questions, and objection handling. Vendor coverage added one by one — see section heading for current count.</w:t>
-      </w:r>
-    </w:p>
-    <w:p/>
-    <w:p/>
-    <w:p/>
-    <w:tbl>
-      <w:tblPr>
-        <w:tblStyle w:val="TableGrid"/>
-        <w:tblW w:type="auto" w:w="0"/>
-        <w:tblLook w:firstColumn="1" w:firstRow="1" w:lastColumn="0" w:lastRow="0" w:noHBand="0" w:noVBand="1" w:val="04A0"/>
-      </w:tblPr>
-      <w:tblGrid>
-        <w:gridCol w:w="4873"/>
-        <w:gridCol w:w="4873"/>
-      </w:tblGrid>
-      <w:tr>
-        <w:tc>
-          <w:tcPr>
-            <w:tcW w:type="dxa" w:w="9746"/>
-            <w:gridSpan w:val="2"/>
-            <w:shd w:val="clear" w:color="auto" w:fill="1B3A5C"/>
-          </w:tcPr>
-          <w:p>
-            <w:r>
-              <w:rPr>
-                <w:b/>
-                <w:i w:val="0"/>
-                <w:color w:val="FFFFFF"/>
-                <w:sz w:val="20"/>
-              </w:rPr>
-              <w:t>TALK TRACK #1  ·  Microsoft Intune  ·  Asset of Interest — Noncompliant Devices  ·  Updated 2026-07-04</w:t>
-            </w:r>
-          </w:p>
-        </w:tc>
-      </w:tr>
-      <w:tr>
-        <w:tc>
-          <w:tcPr>
-            <w:tcW w:type="dxa" w:w="4873"/>
-            <w:shd w:val="clear" w:color="auto" w:fill="F5F5F5"/>
-          </w:tcPr>
-          <w:p>
-            <w:r>
-              <w:rPr>
-                <w:b/>
-                <w:i w:val="0"/>
-                <w:color w:val="000000"/>
-                <w:sz w:val="18"/>
-              </w:rPr>
-              <w:t>Audience</w:t>
-            </w:r>
-          </w:p>
-        </w:tc>
-        <w:tc>
-          <w:tcPr>
-            <w:tcW w:type="dxa" w:w="4873"/>
-            <w:shd w:val="clear" w:color="auto" w:fill="FFFFFF"/>
-          </w:tcPr>
-          <w:p>
-            <w:r>
-              <w:rPr>
-                <w:b w:val="0"/>
-                <w:i w:val="0"/>
-                <w:color w:val="000000"/>
-                <w:sz w:val="18"/>
-              </w:rPr>
-              <w:t>Security architects, IT operations leads, risk/compliance owners.</w:t>
-            </w:r>
-          </w:p>
-        </w:tc>
-      </w:tr>
-      <w:tr>
-        <w:tc>
-          <w:tcPr>
-            <w:tcW w:type="dxa" w:w="4873"/>
-            <w:shd w:val="clear" w:color="auto" w:fill="F5F5F5"/>
-          </w:tcPr>
-          <w:p>
-            <w:r>
-              <w:rPr>
-                <w:b/>
-                <w:i w:val="0"/>
-                <w:color w:val="000000"/>
-                <w:sz w:val="18"/>
-              </w:rPr>
-              <w:t>Duration</w:t>
-            </w:r>
-          </w:p>
-        </w:tc>
-        <w:tc>
-          <w:tcPr>
-            <w:tcW w:type="dxa" w:w="4873"/>
-            <w:shd w:val="clear" w:color="auto" w:fill="FFFFFF"/>
-          </w:tcPr>
-          <w:p>
-            <w:r>
-              <w:rPr>
-                <w:b w:val="0"/>
-                <w:i w:val="0"/>
-                <w:color w:val="000000"/>
-                <w:sz w:val="18"/>
-              </w:rPr>
-              <w:t>6–10 min for Section A (today's demo). Expands to 15–20 min once UAI connector bugs are resolved.</w:t>
-            </w:r>
-          </w:p>
-        </w:tc>
-      </w:tr>
-      <w:tr>
-        <w:tc>
-          <w:tcPr>
-            <w:tcW w:type="dxa" w:w="4873"/>
-            <w:shd w:val="clear" w:color="auto" w:fill="C62828"/>
-          </w:tcPr>
-          <w:p>
-            <w:r>
-              <w:rPr>
-                <w:b/>
-                <w:i w:val="0"/>
-                <w:color w:val="FFFFFF"/>
-                <w:sz w:val="18"/>
-              </w:rPr>
-              <w:t>Status</w:t>
-            </w:r>
-          </w:p>
-        </w:tc>
-        <w:tc>
-          <w:tcPr>
-            <w:tcW w:type="dxa" w:w="4873"/>
-            <w:shd w:val="clear" w:color="auto" w:fill="FFFFFF"/>
-          </w:tcPr>
-          <w:p>
-            <w:r>
-              <w:rPr>
-                <w:b w:val="0"/>
-                <w:i w:val="0"/>
-                <w:color w:val="000000"/>
-                <w:sz w:val="18"/>
-              </w:rPr>
-              <w:t>PARTIAL — IP, Location, WHY-noncompliant and several enriched fields are NOT visible in UAI due to known connector bugs (BUG-001 to BUG-007 in Intune_Bugs.xlsx). Demo story is adjusted accordingly.</w:t>
-            </w:r>
-          </w:p>
-        </w:tc>
-      </w:tr>
-      <w:tr>
-        <w:tc>
-          <w:tcPr>
-            <w:tcW w:type="dxa" w:w="9746"/>
-            <w:gridSpan w:val="2"/>
-            <w:shd w:val="clear" w:color="auto" w:fill="37474F"/>
-          </w:tcPr>
-          <w:p>
-            <w:r>
-              <w:rPr>
-                <w:b/>
-                <w:i w:val="0"/>
-                <w:color w:val="FFFFFF"/>
-                <w:sz w:val="20"/>
-              </w:rPr>
-              <w:t>PRE-DEMO SETUP</w:t>
-            </w:r>
-          </w:p>
-        </w:tc>
-      </w:tr>
-      <w:tr>
-        <w:tc>
-          <w:tcPr>
-            <w:tcW w:type="dxa" w:w="4873"/>
-            <w:shd w:val="clear" w:color="auto" w:fill="F5F5F5"/>
-          </w:tcPr>
-          <w:p>
-            <w:r>
-              <w:rPr>
-                <w:b/>
-                <w:i w:val="0"/>
-                <w:color w:val="000000"/>
-                <w:sz w:val="18"/>
-              </w:rPr>
-              <w:t>Setup steps</w:t>
-            </w:r>
-          </w:p>
-        </w:tc>
-        <w:tc>
-          <w:tcPr>
-            <w:tcW w:type="dxa" w:w="4873"/>
-            <w:shd w:val="clear" w:color="auto" w:fill="FFFFFF"/>
-          </w:tcPr>
-          <w:p>
-            <w:r>
-              <w:rPr>
-                <w:b w:val="0"/>
-                <w:i w:val="0"/>
-                <w:color w:val="000000"/>
-                <w:sz w:val="18"/>
-              </w:rPr>
-              <w:t>1. Run Autowire → Microsoft Intune from the Mock Deployer (MicrosoftIntune_Job must exist and show last sync &lt; 2 hrs ago)</w:t>
-              <w:br/>
-              <w:t>2. In UAI → Assets, confirm 763 Microsoft Intune devices are visible</w:t>
-              <w:br/>
-              <w:t>3. Filter by complianceState — confirm ~62 noncompliant and ~62 inGracePeriod devices appear</w:t>
-              <w:br/>
-              <w:t>4. Confirm partner_reported_threat_state is visible in at least one device's Properties panel</w:t>
-            </w:r>
-          </w:p>
-        </w:tc>
-      </w:tr>
-      <w:tr>
-        <w:tc>
-          <w:tcPr>
-            <w:tcW w:type="dxa" w:w="4873"/>
-            <w:shd w:val="clear" w:color="auto" w:fill="FFF3CD"/>
-          </w:tcPr>
-          <w:p>
-            <w:r>
-              <w:rPr>
-                <w:b/>
-                <w:i w:val="0"/>
-                <w:color w:val="000000"/>
-                <w:sz w:val="18"/>
-              </w:rPr>
-              <w:t>⚠️  Critical reality check</w:t>
-            </w:r>
-          </w:p>
-        </w:tc>
-        <w:tc>
-          <w:tcPr>
-            <w:tcW w:type="dxa" w:w="4873"/>
-            <w:shd w:val="clear" w:color="auto" w:fill="FFF3CD"/>
-          </w:tcPr>
-          <w:p>
-            <w:r>
-              <w:rPr>
-                <w:b w:val="0"/>
-                <w:i w:val="0"/>
-                <w:color w:val="000000"/>
-                <w:sz w:val="18"/>
-              </w:rPr>
-              <w:t>IP Address, Location and Region are BLANK for ALL Intune assets (BUG-001 — MAC not stored by UAI). Remove any mention of 'show the IP address' or 'show network location' from your script. The demo story today is compliance state + threat signal correlation — not network location.</w:t>
-            </w:r>
-          </w:p>
-        </w:tc>
-      </w:tr>
-      <w:tr>
-        <w:tc>
-          <w:tcPr>
-            <w:tcW w:type="dxa" w:w="9746"/>
-            <w:gridSpan w:val="2"/>
-            <w:shd w:val="clear" w:color="auto" w:fill="1B5E20"/>
-          </w:tcPr>
-          <w:p>
-            <w:r>
-              <w:rPr>
-                <w:b/>
-                <w:i w:val="0"/>
-                <w:color w:val="FFFFFF"/>
-                <w:sz w:val="20"/>
-              </w:rPr>
-              <w:t>SECTION A  —  WHAT YOU CAN DEMO TODAY</w:t>
-            </w:r>
-          </w:p>
-        </w:tc>
-      </w:tr>
-      <w:tr>
-        <w:tc>
-          <w:tcPr>
-            <w:tcW w:type="dxa" w:w="4873"/>
-            <w:shd w:val="clear" w:color="auto" w:fill="F5F5F5"/>
-          </w:tcPr>
-          <w:p>
-            <w:r>
-              <w:rPr>
-                <w:b/>
-                <w:i w:val="0"/>
-                <w:color w:val="000000"/>
-                <w:sz w:val="18"/>
-              </w:rPr>
-              <w:t>STEP 1</w:t>
-              <w:br/>
-              <w:t>Set the scene</w:t>
-            </w:r>
-          </w:p>
-        </w:tc>
-        <w:tc>
-          <w:tcPr>
-            <w:tcW w:type="dxa" w:w="4873"/>
-            <w:shd w:val="clear" w:color="auto" w:fill="FFFFFF"/>
-          </w:tcPr>
-          <w:p>
-            <w:r>
-              <w:rPr>
-                <w:b w:val="0"/>
-                <w:i w:val="0"/>
-                <w:color w:val="000000"/>
-                <w:sz w:val="18"/>
-              </w:rPr>
-              <w:t>Navigate to UAI → Asset Insights → Assets.</w:t>
-              <w:br/>
-              <w:t>Show the full fleet: 763 Microsoft Intune-managed devices — Windows laptops, VDI machines, Android phones.</w:t>
-              <w:br/>
-              <w:br/>
-              <w:t>Say: "Every one of these devices is enrolled in your MDM. Intune knows their compliance state. UAI takes that compliance signal and puts it on the same canvas as your network."</w:t>
-            </w:r>
-          </w:p>
-        </w:tc>
-      </w:tr>
-      <w:tr>
-        <w:tc>
-          <w:tcPr>
-            <w:tcW w:type="dxa" w:w="4873"/>
-            <w:shd w:val="clear" w:color="auto" w:fill="F5F5F5"/>
-          </w:tcPr>
-          <w:p>
-            <w:r>
-              <w:rPr>
-                <w:b/>
-                <w:i w:val="0"/>
-                <w:color w:val="000000"/>
-                <w:sz w:val="18"/>
-              </w:rPr>
-              <w:t>STEP 2</w:t>
-              <w:br/>
-              <w:t>Surface noncompliant devices</w:t>
-            </w:r>
-          </w:p>
-        </w:tc>
-        <w:tc>
-          <w:tcPr>
-            <w:tcW w:type="dxa" w:w="4873"/>
-            <w:shd w:val="clear" w:color="auto" w:fill="FFFFFF"/>
-          </w:tcPr>
-          <w:p>
-            <w:r>
-              <w:rPr>
-                <w:b w:val="0"/>
-                <w:i w:val="0"/>
-                <w:color w:val="000000"/>
-                <w:sz w:val="18"/>
-              </w:rPr>
-              <w:t>Filter by Compliance State: noncompliant (62 devices appear).</w:t>
-              <w:br/>
-              <w:br/>
-              <w:t>Say: "62 devices are actively violating your MDM policy right now. That's 8% of your managed fleet. Let's look at what we actually know about them."</w:t>
-            </w:r>
-          </w:p>
-        </w:tc>
-      </w:tr>
-      <w:tr>
-        <w:tc>
-          <w:tcPr>
-            <w:tcW w:type="dxa" w:w="4873"/>
-            <w:shd w:val="clear" w:color="auto" w:fill="EEF3F8"/>
-          </w:tcPr>
-          <w:p>
-            <w:r>
-              <w:rPr>
-                <w:b/>
-                <w:i w:val="0"/>
-                <w:color w:val="000000"/>
-                <w:sz w:val="18"/>
-              </w:rPr>
-              <w:t>↳ Say this</w:t>
-            </w:r>
-          </w:p>
-        </w:tc>
-        <w:tc>
-          <w:tcPr>
-            <w:tcW w:type="dxa" w:w="4873"/>
-            <w:shd w:val="clear" w:color="auto" w:fill="EEF3F8"/>
-          </w:tcPr>
-          <w:p>
-            <w:r>
-              <w:rPr>
-                <w:b w:val="0"/>
-                <w:i w:val="0"/>
-                <w:color w:val="000000"/>
-                <w:sz w:val="18"/>
-              </w:rPr>
-              <w:t>"Notice what UAI adds that Intune alone cannot: whether these devices are Windows laptops, VDI machines, or Android phones — and which are corporate-owned vs BYOD. The compliance violation is the same fact, but the risk profile is very different."</w:t>
-            </w:r>
-          </w:p>
-        </w:tc>
-      </w:tr>
-      <w:tr>
-        <w:tc>
-          <w:tcPr>
-            <w:tcW w:type="dxa" w:w="4873"/>
-            <w:shd w:val="clear" w:color="auto" w:fill="F5F5F5"/>
-          </w:tcPr>
-          <w:p>
-            <w:r>
-              <w:rPr>
-                <w:b/>
-                <w:i w:val="0"/>
-                <w:color w:val="000000"/>
-                <w:sz w:val="18"/>
-              </w:rPr>
-              <w:t>STEP 3</w:t>
-              <w:br/>
-              <w:t>Grace period urgency</w:t>
-            </w:r>
-          </w:p>
-        </w:tc>
-        <w:tc>
-          <w:tcPr>
-            <w:tcW w:type="dxa" w:w="4873"/>
-            <w:shd w:val="clear" w:color="auto" w:fill="FFFFFF"/>
-          </w:tcPr>
-          <w:p>
-            <w:r>
-              <w:rPr>
-                <w:b w:val="0"/>
-                <w:i w:val="0"/>
-                <w:color w:val="000000"/>
-                <w:sz w:val="18"/>
-              </w:rPr>
-              <w:t>Change the filter to inGracePeriod compliance state (62 devices).</w:t>
-              <w:br/>
-              <w:br/>
-              <w:t>Say: "These 62 are on a countdown. They're not yet blocked — but the policy grace period is ticking. Three of them expire TODAY: lsys-sgp-lap-0018, lsys-nyc-lap-0360, lsys-sfo-and-1435. After today, Intune marks them noncompliant and — depending on Conditional Access — they may lose access to corporate resources."</w:t>
-            </w:r>
-          </w:p>
-        </w:tc>
-      </w:tr>
-      <w:tr>
-        <w:tc>
-          <w:tcPr>
-            <w:tcW w:type="dxa" w:w="4873"/>
-            <w:shd w:val="clear" w:color="auto" w:fill="F5F5F5"/>
-          </w:tcPr>
-          <w:p>
-            <w:r>
-              <w:rPr>
-                <w:b/>
-                <w:i w:val="0"/>
-                <w:color w:val="000000"/>
-                <w:sz w:val="18"/>
-              </w:rPr>
-              <w:t>STEP 4</w:t>
-              <w:br/>
-              <w:t>CrowdStrike cross-vendor</w:t>
-            </w:r>
-          </w:p>
-        </w:tc>
-        <w:tc>
-          <w:tcPr>
-            <w:tcW w:type="dxa" w:w="4873"/>
-            <w:shd w:val="clear" w:color="auto" w:fill="FFFFFF"/>
-          </w:tcPr>
-          <w:p>
-            <w:r>
-              <w:rPr>
-                <w:b w:val="0"/>
-                <w:i w:val="0"/>
-                <w:color w:val="000000"/>
-                <w:sz w:val="18"/>
-              </w:rPr>
-              <w:t>Click into any noncompliant Windows laptop. Scroll to the Sources section.</w:t>
-              <w:br/>
-              <w:t>Show that the device also appears in CrowdStrike Falcon.</w:t>
-              <w:br/>
-              <w:br/>
-              <w:t>Say: "44 of these noncompliant Windows devices are also visible in CrowdStrike Falcon. UAI correlates both sources on the same asset — you get one record, not two separate alerts. Intune says the device is out of policy. CrowdStrike shows its threat posture. Together, that's the full risk picture."</w:t>
-            </w:r>
-          </w:p>
-        </w:tc>
-      </w:tr>
-      <w:tr>
-        <w:tc>
-          <w:tcPr>
-            <w:tcW w:type="dxa" w:w="4873"/>
-            <w:shd w:val="clear" w:color="auto" w:fill="F5F5F5"/>
-          </w:tcPr>
-          <w:p>
-            <w:r>
-              <w:rPr>
-                <w:b/>
-                <w:i w:val="0"/>
-                <w:color w:val="000000"/>
-                <w:sz w:val="18"/>
-              </w:rPr>
-              <w:t>STEP 5</w:t>
-              <w:br/>
-              <w:t>Threat signal</w:t>
-            </w:r>
-          </w:p>
-        </w:tc>
-        <w:tc>
-          <w:tcPr>
-            <w:tcW w:type="dxa" w:w="4873"/>
-            <w:shd w:val="clear" w:color="auto" w:fill="FFFFFF"/>
-          </w:tcPr>
-          <w:p>
-            <w:r>
-              <w:rPr>
-                <w:b w:val="0"/>
-                <w:i w:val="0"/>
-                <w:color w:val="000000"/>
-                <w:sz w:val="18"/>
-              </w:rPr>
-              <w:t>Open a noncompliant Windows device → Properties → partner_reported_threat_state.</w:t>
-              <w:br/>
-              <w:t>Show: unknown.</w:t>
-              <w:br/>
-              <w:br/>
-              <w:t>Then open a compliant Windows device → same field.</w:t>
-              <w:br/>
-              <w:t>Show: secure.</w:t>
-              <w:br/>
-              <w:br/>
-              <w:t>Say: "For devices that are CrowdStrike-protected and compliant, the threat signal is clean — 'secure'. For noncompliant devices, the signal is 'unknown' — CrowdStrike can't confirm the agent is reporting correctly. That's a compounding risk: out of policy AND the endpoint protection signal is dark."</w:t>
-            </w:r>
-          </w:p>
-        </w:tc>
-      </w:tr>
-      <w:tr>
-        <w:tc>
-          <w:tcPr>
-            <w:tcW w:type="dxa" w:w="4873"/>
-            <w:shd w:val="clear" w:color="auto" w:fill="EEF3F8"/>
-          </w:tcPr>
-          <w:p>
-            <w:r>
-              <w:rPr>
-                <w:b/>
-                <w:i w:val="0"/>
-                <w:color w:val="000000"/>
-                <w:sz w:val="18"/>
-              </w:rPr>
-              <w:t>↳ Talking point</w:t>
-            </w:r>
-          </w:p>
-        </w:tc>
-        <w:tc>
-          <w:tcPr>
-            <w:tcW w:type="dxa" w:w="4873"/>
-            <w:shd w:val="clear" w:color="auto" w:fill="EEF3F8"/>
-          </w:tcPr>
-          <w:p>
-            <w:r>
-              <w:rPr>
-                <w:b w:val="0"/>
-                <w:i w:val="0"/>
-                <w:color w:val="000000"/>
-                <w:sz w:val="18"/>
-              </w:rPr>
-              <w:t>"This is not just an MDM finding. This is a network and endpoint risk finding. Infoblox sees the device across MDM and EDR simultaneously."</w:t>
-            </w:r>
-          </w:p>
-        </w:tc>
-      </w:tr>
-      <w:tr>
-        <w:tc>
-          <w:tcPr>
-            <w:tcW w:type="dxa" w:w="4873"/>
-            <w:shd w:val="clear" w:color="auto" w:fill="F5F5F5"/>
-          </w:tcPr>
-          <w:p>
-            <w:r>
-              <w:rPr>
-                <w:b/>
-                <w:i w:val="0"/>
-                <w:color w:val="000000"/>
-                <w:sz w:val="18"/>
-              </w:rPr>
-              <w:t>STEP 6</w:t>
-              <w:br/>
-              <w:t>VDI anomaly</w:t>
-            </w:r>
-          </w:p>
-        </w:tc>
-        <w:tc>
-          <w:tcPr>
-            <w:tcW w:type="dxa" w:w="4873"/>
-            <w:shd w:val="clear" w:color="auto" w:fill="FFFFFF"/>
-          </w:tcPr>
-          <w:p>
-            <w:r>
-              <w:rPr>
-                <w:b w:val="0"/>
-                <w:i w:val="0"/>
-                <w:color w:val="000000"/>
-                <w:sz w:val="18"/>
-              </w:rPr>
-              <w:t>Search hostname: lsys-lon-vdi-0929 or lsys-sfo-vdi-0904 (noncompliant VDI devices).</w:t>
-              <w:br/>
-              <w:br/>
-              <w:t>Say: "VDI machines failing compliance is a different category of risk — these are shared infrastructure endpoints, not personal laptops. If a VDI image is noncompliant, every session running on it inherits that posture."</w:t>
-            </w:r>
-          </w:p>
-        </w:tc>
-      </w:tr>
-      <w:tr>
-        <w:tc>
-          <w:tcPr>
-            <w:tcW w:type="dxa" w:w="9746"/>
-            <w:gridSpan w:val="2"/>
-            <w:shd w:val="clear" w:color="auto" w:fill="37474F"/>
-          </w:tcPr>
-          <w:p>
-            <w:r>
-              <w:rPr>
-                <w:b/>
-                <w:i w:val="0"/>
-                <w:color w:val="FFFFFF"/>
-                <w:sz w:val="20"/>
-              </w:rPr>
-              <w:t>DISCOVERY QUESTIONS</w:t>
-            </w:r>
-          </w:p>
-        </w:tc>
-      </w:tr>
-      <w:tr>
-        <w:tc>
-          <w:tcPr>
-            <w:tcW w:type="dxa" w:w="4873"/>
-            <w:shd w:val="clear" w:color="auto" w:fill="F5F5F5"/>
-          </w:tcPr>
-          <w:p>
-            <w:r>
-              <w:rPr>
-                <w:b/>
-                <w:i w:val="0"/>
-                <w:color w:val="000000"/>
-                <w:sz w:val="18"/>
-              </w:rPr>
-              <w:t>Questions to ask</w:t>
-            </w:r>
-          </w:p>
-        </w:tc>
-        <w:tc>
-          <w:tcPr>
-            <w:tcW w:type="dxa" w:w="4873"/>
-            <w:shd w:val="clear" w:color="auto" w:fill="FFFFFF"/>
-          </w:tcPr>
-          <w:p>
-            <w:r>
-              <w:rPr>
-                <w:b w:val="0"/>
-                <w:i w:val="0"/>
-                <w:color w:val="000000"/>
-                <w:sz w:val="18"/>
-              </w:rPr>
-              <w:t>1. "How do you currently identify which noncompliant Intune devices are actively being used — not just enrolled?"</w:t>
-              <w:br/>
-              <w:t>2. "When a device hits grace period expiry, how long before your team knows — and how do you find it on the network?"</w:t>
-              <w:br/>
-              <w:t>3. "If a device is noncompliant AND its EDR agent goes dark, what's your current detection time?"</w:t>
-            </w:r>
-          </w:p>
-        </w:tc>
-      </w:tr>
-      <w:tr>
-        <w:tc>
-          <w:tcPr>
-            <w:tcW w:type="dxa" w:w="9746"/>
-            <w:gridSpan w:val="2"/>
-            <w:shd w:val="clear" w:color="auto" w:fill="C62828"/>
-          </w:tcPr>
-          <w:p>
-            <w:r>
-              <w:rPr>
-                <w:b/>
-                <w:i w:val="0"/>
-                <w:color w:val="FFFFFF"/>
-                <w:sz w:val="20"/>
-              </w:rPr>
-              <w:t>SECTION B  —  WHAT IS NOT POSSIBLE TODAY (UAI Connector Gaps)</w:t>
-            </w:r>
-          </w:p>
-        </w:tc>
-      </w:tr>
-      <w:tr>
-        <w:tc>
-          <w:tcPr>
-            <w:tcW w:type="dxa" w:w="4873"/>
-            <w:shd w:val="clear" w:color="auto" w:fill="F5F5F5"/>
-          </w:tcPr>
-          <w:p>
-            <w:r>
-              <w:rPr>
-                <w:b/>
-                <w:i w:val="0"/>
-                <w:color w:val="000000"/>
-                <w:sz w:val="18"/>
-              </w:rPr>
-              <w:t>Context</w:t>
-            </w:r>
-          </w:p>
-        </w:tc>
-        <w:tc>
-          <w:tcPr>
-            <w:tcW w:type="dxa" w:w="4873"/>
-            <w:shd w:val="clear" w:color="auto" w:fill="FDECEA"/>
-          </w:tcPr>
-          <w:p>
-            <w:r>
-              <w:rPr>
-                <w:b w:val="0"/>
-                <w:i w:val="0"/>
-                <w:color w:val="000000"/>
-                <w:sz w:val="18"/>
-              </w:rPr>
-              <w:t>The Intune mock API returns rich data for all fields below. UAI fetches them in its $select but does not store them due to connector mapping bugs (BUG-001 to BUG-007 in Intune_Bugs.xlsx). Do NOT attempt to demo these — they will show blank/null in the portal and undermine the story.</w:t>
-            </w:r>
-          </w:p>
-        </w:tc>
-      </w:tr>
-      <w:tr>
-        <w:tc>
-          <w:tcPr>
-            <w:tcW w:type="dxa" w:w="4873"/>
-            <w:shd w:val="clear" w:color="auto" w:fill="FDECEA"/>
-          </w:tcPr>
-          <w:p>
-            <w:r>
-              <w:rPr>
-                <w:b/>
-                <w:i w:val="0"/>
-                <w:color w:val="000000"/>
-                <w:sz w:val="18"/>
-              </w:rPr>
-              <w:t>IP Address / Location / Region</w:t>
-              <w:br/>
-              <w:t>(BUG-001)</w:t>
-            </w:r>
-          </w:p>
-        </w:tc>
-        <w:tc>
-          <w:tcPr>
-            <w:tcW w:type="dxa" w:w="4873"/>
-            <w:shd w:val="clear" w:color="auto" w:fill="FDECEA"/>
-          </w:tcPr>
-          <w:p>
-            <w:r>
-              <w:rPr>
-                <w:b w:val="0"/>
-                <w:i w:val="0"/>
-                <w:color w:val="000000"/>
-                <w:sz w:val="18"/>
-              </w:rPr>
-              <w:t>Mock returns correct MAC address → should resolve to IP via DHCP. UAI stores empty MAC. All Intune assets show no IP, no Location, no Region. Cannot show network presence.</w:t>
-            </w:r>
-          </w:p>
-        </w:tc>
-      </w:tr>
-      <w:tr>
-        <w:tc>
-          <w:tcPr>
-            <w:tcW w:type="dxa" w:w="4873"/>
-            <w:shd w:val="clear" w:color="auto" w:fill="FDECEA"/>
-          </w:tcPr>
-          <w:p>
-            <w:r>
-              <w:rPr>
-                <w:b/>
-                <w:i w:val="0"/>
-                <w:color w:val="000000"/>
-                <w:sz w:val="18"/>
-              </w:rPr>
-              <w:t>WHY the device is noncompliant</w:t>
-              <w:br/>
-              <w:t>(BUG-003)</w:t>
-            </w:r>
-          </w:p>
-        </w:tc>
-        <w:tc>
-          <w:tcPr>
-            <w:tcW w:type="dxa" w:w="4873"/>
-            <w:shd w:val="clear" w:color="auto" w:fill="FDECEA"/>
-          </w:tcPr>
-          <w:p>
-            <w:r>
-              <w:rPr>
-                <w:b w:val="0"/>
-                <w:i w:val="0"/>
-                <w:color w:val="000000"/>
-                <w:sz w:val="18"/>
-              </w:rPr>
-              <w:t>Mock returns deviceHealthAttestationState with BitLocker status, Secure Boot state, TPM version. UAI discards the entire object (null). Cannot explain the compliance failure.</w:t>
-            </w:r>
-          </w:p>
-        </w:tc>
-      </w:tr>
-      <w:tr>
-        <w:tc>
-          <w:tcPr>
-            <w:tcW w:type="dxa" w:w="4873"/>
-            <w:shd w:val="clear" w:color="auto" w:fill="FFFDE7"/>
-          </w:tcPr>
-          <w:p>
-            <w:r>
-              <w:rPr>
-                <w:b/>
-                <w:i w:val="0"/>
-                <w:color w:val="000000"/>
-                <w:sz w:val="18"/>
-              </w:rPr>
-              <w:t>Enrollment profile</w:t>
-              <w:br/>
-              <w:t>(BUG-004)</w:t>
-            </w:r>
-          </w:p>
-        </w:tc>
-        <w:tc>
-          <w:tcPr>
-            <w:tcW w:type="dxa" w:w="4873"/>
-            <w:shd w:val="clear" w:color="auto" w:fill="FFFDE7"/>
-          </w:tcPr>
-          <w:p>
-            <w:r>
-              <w:rPr>
-                <w:b w:val="0"/>
-                <w:i w:val="0"/>
-                <w:color w:val="000000"/>
-                <w:sz w:val="18"/>
-              </w:rPr>
-              <w:t>Mock returns Autopilot profile name (Luminary-Autopilot-Corporate, etc.). UAI stores empty string. Cannot differentiate enrollment type.</w:t>
-            </w:r>
-          </w:p>
-        </w:tc>
-      </w:tr>
-      <w:tr>
-        <w:tc>
-          <w:tcPr>
-            <w:tcW w:type="dxa" w:w="4873"/>
-            <w:shd w:val="clear" w:color="auto" w:fill="FFFDE7"/>
-          </w:tcPr>
-          <w:p>
-            <w:r>
-              <w:rPr>
-                <w:b/>
-                <w:i w:val="0"/>
-                <w:color w:val="000000"/>
-                <w:sz w:val="18"/>
-              </w:rPr>
-              <w:t>MDM cert expiry</w:t>
-              <w:br/>
-              <w:t>(BUG-005)</w:t>
-            </w:r>
-          </w:p>
-        </w:tc>
-        <w:tc>
-          <w:tcPr>
-            <w:tcW w:type="dxa" w:w="4873"/>
-            <w:shd w:val="clear" w:color="auto" w:fill="FFFDE7"/>
-          </w:tcPr>
-          <w:p>
-            <w:r>
-              <w:rPr>
-                <w:b w:val="0"/>
-                <w:i w:val="0"/>
-                <w:color w:val="000000"/>
-                <w:sz w:val="18"/>
-              </w:rPr>
-              <w:t>Mock returns cert expiration date. UAI stores null. Cannot show proactive cert management story.</w:t>
-            </w:r>
-          </w:p>
-        </w:tc>
-      </w:tr>
-      <w:tr>
-        <w:tc>
-          <w:tcPr>
-            <w:tcW w:type="dxa" w:w="4873"/>
-            <w:shd w:val="clear" w:color="auto" w:fill="FFFDE7"/>
-          </w:tcPr>
-          <w:p>
-            <w:r>
-              <w:rPr>
-                <w:b/>
-                <w:i w:val="0"/>
-                <w:color w:val="000000"/>
-                <w:sz w:val="18"/>
-              </w:rPr>
-              <w:t>RAM / Memory</w:t>
-              <w:br/>
-              <w:t>(BUG-002)</w:t>
-            </w:r>
-          </w:p>
-        </w:tc>
-        <w:tc>
-          <w:tcPr>
-            <w:tcW w:type="dxa" w:w="4873"/>
-            <w:shd w:val="clear" w:color="auto" w:fill="FFFDE7"/>
-          </w:tcPr>
-          <w:p>
-            <w:r>
-              <w:rPr>
-                <w:b w:val="0"/>
-                <w:i w:val="0"/>
-                <w:color w:val="000000"/>
-                <w:sz w:val="18"/>
-              </w:rPr>
-              <w:t>Mock returns correct physicalMemoryInBytes. UAI stores '0'. Cannot show hardware specs.</w:t>
-            </w:r>
-          </w:p>
-        </w:tc>
-      </w:tr>
-      <w:tr>
-        <w:tc>
-          <w:tcPr>
-            <w:tcW w:type="dxa" w:w="9746"/>
-            <w:gridSpan w:val="2"/>
-            <w:shd w:val="clear" w:color="auto" w:fill="006064"/>
-          </w:tcPr>
-          <w:p>
-            <w:r>
-              <w:rPr>
-                <w:b/>
-                <w:i w:val="0"/>
-                <w:color w:val="FFFFFF"/>
-                <w:sz w:val="20"/>
-              </w:rPr>
-              <w:t>SECTION C  —  WHAT BECOMES POSSIBLE ONCE UAI FIXES THE CONNECTOR</w:t>
-            </w:r>
-          </w:p>
-        </w:tc>
-      </w:tr>
-      <w:tr>
-        <w:tc>
-          <w:tcPr>
-            <w:tcW w:type="dxa" w:w="4873"/>
-            <w:shd w:val="clear" w:color="auto" w:fill="F5F5F5"/>
-          </w:tcPr>
-          <w:p>
-            <w:r>
-              <w:rPr>
-                <w:b/>
-                <w:i w:val="0"/>
-                <w:color w:val="000000"/>
-                <w:sz w:val="18"/>
-              </w:rPr>
-              <w:t>Network location story</w:t>
-              <w:br/>
-              <w:t>(after BUG-001 fix)</w:t>
-            </w:r>
-          </w:p>
-        </w:tc>
-        <w:tc>
-          <w:tcPr>
-            <w:tcW w:type="dxa" w:w="4873"/>
-            <w:shd w:val="clear" w:color="auto" w:fill="FFFFFF"/>
-          </w:tcPr>
-          <w:p>
-            <w:r>
-              <w:rPr>
-                <w:b w:val="0"/>
-                <w:i w:val="0"/>
-                <w:color w:val="000000"/>
-                <w:sz w:val="18"/>
-              </w:rPr>
-              <w:t>Show noncompliant devices on a map. "This device is noncompliant AND it's physically in the Singapore office on subnet 10.22.4.0/24. Your network team can isolate it."</w:t>
-            </w:r>
-          </w:p>
-        </w:tc>
-      </w:tr>
-      <w:tr>
-        <w:tc>
-          <w:tcPr>
-            <w:tcW w:type="dxa" w:w="4873"/>
-            <w:shd w:val="clear" w:color="auto" w:fill="F5F5F5"/>
-          </w:tcPr>
-          <w:p>
-            <w:r>
-              <w:rPr>
-                <w:b/>
-                <w:i w:val="0"/>
-                <w:color w:val="000000"/>
-                <w:sz w:val="18"/>
-              </w:rPr>
-              <w:t>Root cause of noncompliance</w:t>
-              <w:br/>
-              <w:t>(after BUG-003 fix)</w:t>
-            </w:r>
-          </w:p>
-        </w:tc>
-        <w:tc>
-          <w:tcPr>
-            <w:tcW w:type="dxa" w:w="4873"/>
-            <w:shd w:val="clear" w:color="auto" w:fill="FFFFFF"/>
-          </w:tcPr>
-          <w:p>
-            <w:r>
-              <w:rPr>
-                <w:b w:val="0"/>
-                <w:i w:val="0"/>
-                <w:color w:val="000000"/>
-                <w:sz w:val="18"/>
-              </w:rPr>
-              <w:t>Open a noncompliant device → show deviceHealthAttestationState: BitLocker OFF, Secure Boot disabled, TPM 1.2. "UAI doesn't just tell you the device is out of policy — it tells you exactly why, without opening Intune."</w:t>
-            </w:r>
-          </w:p>
-        </w:tc>
-      </w:tr>
-      <w:tr>
-        <w:tc>
-          <w:tcPr>
-            <w:tcW w:type="dxa" w:w="4873"/>
-            <w:shd w:val="clear" w:color="auto" w:fill="F5F5F5"/>
-          </w:tcPr>
-          <w:p>
-            <w:r>
-              <w:rPr>
-                <w:b/>
-                <w:i w:val="0"/>
-                <w:color w:val="000000"/>
-                <w:sz w:val="18"/>
-              </w:rPr>
-              <w:t>Proactive cert management</w:t>
-              <w:br/>
-              <w:t>(after BUG-005 fix)</w:t>
-            </w:r>
-          </w:p>
-        </w:tc>
-        <w:tc>
-          <w:tcPr>
-            <w:tcW w:type="dxa" w:w="4873"/>
-            <w:shd w:val="clear" w:color="auto" w:fill="FFFFFF"/>
-          </w:tcPr>
-          <w:p>
-            <w:r>
-              <w:rPr>
-                <w:b w:val="0"/>
-                <w:i w:val="0"/>
-                <w:color w:val="000000"/>
-                <w:sz w:val="18"/>
-              </w:rPr>
-              <w:t>Filter devices whose management cert expires in the next 30 days. "Before UAI, this required an Intune report or a PowerShell script. Here it's a one-click filter across your entire fleet."</w:t>
-            </w:r>
-          </w:p>
-        </w:tc>
-      </w:tr>
-      <w:tr>
-        <w:tc>
-          <w:tcPr>
-            <w:tcW w:type="dxa" w:w="4873"/>
-            <w:shd w:val="clear" w:color="auto" w:fill="F5F5F5"/>
-          </w:tcPr>
-          <w:p>
-            <w:r>
-              <w:rPr>
-                <w:b/>
-                <w:i w:val="0"/>
-                <w:color w:val="000000"/>
-                <w:sz w:val="18"/>
-              </w:rPr>
-              <w:t>Corp vs BYOD risk segmentation</w:t>
-              <w:br/>
-              <w:t>(after BUG-004 fix)</w:t>
-            </w:r>
-          </w:p>
-        </w:tc>
-        <w:tc>
-          <w:tcPr>
-            <w:tcW w:type="dxa" w:w="4873"/>
-            <w:shd w:val="clear" w:color="auto" w:fill="FFFFFF"/>
-          </w:tcPr>
-          <w:p>
-            <w:r>
-              <w:rPr>
-                <w:b w:val="0"/>
-                <w:i w:val="0"/>
-                <w:color w:val="000000"/>
-                <w:sz w:val="18"/>
-              </w:rPr>
-              <w:t>Filter noncompliant BYOD-enrolled devices separately from corporate Autopilot devices. Different remediation paths, different risk owners.</w:t>
-            </w:r>
-          </w:p>
-        </w:tc>
-      </w:tr>
-      <w:tr>
-        <w:tc>
-          <w:tcPr>
-            <w:tcW w:type="dxa" w:w="9746"/>
-            <w:gridSpan w:val="2"/>
-            <w:shd w:val="clear" w:color="auto" w:fill="37474F"/>
-          </w:tcPr>
-          <w:p>
-            <w:r>
-              <w:rPr>
-                <w:b/>
-                <w:i w:val="0"/>
-                <w:color w:val="FFFFFF"/>
-                <w:sz w:val="20"/>
-              </w:rPr>
-              <w:t>OBJECTIONS</w:t>
-            </w:r>
-          </w:p>
-        </w:tc>
-      </w:tr>
-      <w:tr>
-        <w:tc>
-          <w:tcPr>
-            <w:tcW w:type="dxa" w:w="4873"/>
-            <w:shd w:val="clear" w:color="auto" w:fill="F5F5F5"/>
-          </w:tcPr>
-          <w:p>
-            <w:r>
-              <w:rPr>
-                <w:b/>
-                <w:i w:val="0"/>
-                <w:color w:val="000000"/>
-                <w:sz w:val="18"/>
-              </w:rPr>
-              <w:t>"We already have Intune Conditional Access"</w:t>
-            </w:r>
-          </w:p>
-        </w:tc>
-        <w:tc>
-          <w:tcPr>
-            <w:tcW w:type="dxa" w:w="4873"/>
-            <w:shd w:val="clear" w:color="auto" w:fill="FFFFFF"/>
-          </w:tcPr>
-          <w:p>
-            <w:r>
-              <w:rPr>
-                <w:b w:val="0"/>
-                <w:i w:val="0"/>
-                <w:color w:val="000000"/>
-                <w:sz w:val="18"/>
-              </w:rPr>
-              <w:t>"Conditional Access is a policy enforcement gate — it blocks or allows. UAI is context enrichment — it tells you WHERE that noncompliant device is on your network, WHAT other security tools see it, and HOW LONG it's been in that state. They do different jobs."</w:t>
-            </w:r>
-          </w:p>
-        </w:tc>
-      </w:tr>
-      <w:tr>
-        <w:tc>
-          <w:tcPr>
-            <w:tcW w:type="dxa" w:w="4873"/>
-            <w:shd w:val="clear" w:color="auto" w:fill="F5F5F5"/>
-          </w:tcPr>
-          <w:p>
-            <w:r>
-              <w:rPr>
-                <w:b/>
-                <w:i w:val="0"/>
-                <w:color w:val="000000"/>
-                <w:sz w:val="18"/>
-              </w:rPr>
-              <w:t>"Can't we get this from SIEM?"</w:t>
-            </w:r>
-          </w:p>
-        </w:tc>
-        <w:tc>
-          <w:tcPr>
-            <w:tcW w:type="dxa" w:w="4873"/>
-            <w:shd w:val="clear" w:color="auto" w:fill="FFFFFF"/>
-          </w:tcPr>
-          <w:p>
-            <w:r>
-              <w:rPr>
-                <w:b w:val="0"/>
-                <w:i w:val="0"/>
-                <w:color w:val="000000"/>
-                <w:sz w:val="18"/>
-              </w:rPr>
-              <w:t>"SIEM aggregates events after they happen. UAI maintains a live asset inventory — compliance state, threat signal, and network presence in one record, updated on every sync. No correlation query needed."</w:t>
-            </w:r>
-          </w:p>
-        </w:tc>
-      </w:tr>
-      <w:tr>
-        <w:tc>
-          <w:tcPr>
-            <w:tcW w:type="dxa" w:w="4873"/>
-            <w:shd w:val="clear" w:color="auto" w:fill="F5F5F5"/>
-          </w:tcPr>
-          <w:p>
-            <w:r>
-              <w:rPr>
-                <w:b/>
-                <w:i w:val="0"/>
-                <w:color w:val="000000"/>
-                <w:sz w:val="18"/>
-              </w:rPr>
-              <w:t>"The IP and location fields are blank"</w:t>
-            </w:r>
-          </w:p>
-        </w:tc>
-        <w:tc>
-          <w:tcPr>
-            <w:tcW w:type="dxa" w:w="4873"/>
-            <w:shd w:val="clear" w:color="auto" w:fill="FFFFFF"/>
-          </w:tcPr>
-          <w:p>
-            <w:r>
-              <w:rPr>
-                <w:b w:val="0"/>
-                <w:i w:val="0"/>
-                <w:color w:val="000000"/>
-                <w:sz w:val="18"/>
-              </w:rPr>
-              <w:t>"Good catch — that's a known UAI connector issue we're tracking. The mock returns correct MAC data; UAI's Intune connector isn't storing it yet. Bug is filed. Once fixed, MAC-to-DHCP correlation lights up IP and location for all Intune assets."</w:t>
-            </w:r>
-          </w:p>
-        </w:tc>
-      </w:tr>
-      <w:tr>
-        <w:tc>
-          <w:tcPr>
-            <w:tcW w:type="dxa" w:w="9746"/>
-            <w:gridSpan w:val="2"/>
-            <w:shd w:val="clear" w:color="auto" w:fill="1B3A5C"/>
-          </w:tcPr>
-          <w:p>
-            <w:r>
-              <w:rPr>
-                <w:b/>
-                <w:i w:val="0"/>
-                <w:color w:val="FFFFFF"/>
-                <w:sz w:val="20"/>
-              </w:rPr>
-              <w:t>CLOSE</w:t>
-            </w:r>
-          </w:p>
-        </w:tc>
-      </w:tr>
-      <w:tr>
-        <w:tc>
-          <w:tcPr>
-            <w:tcW w:type="dxa" w:w="4873"/>
-            <w:shd w:val="clear" w:color="auto" w:fill="F5F5F5"/>
-          </w:tcPr>
-          <w:p>
-            <w:r>
-              <w:rPr>
-                <w:b/>
-                <w:i w:val="0"/>
-                <w:color w:val="000000"/>
-                <w:sz w:val="18"/>
-              </w:rPr>
-              <w:t>Close line</w:t>
-            </w:r>
-          </w:p>
-        </w:tc>
-        <w:tc>
-          <w:tcPr>
-            <w:tcW w:type="dxa" w:w="4873"/>
-            <w:shd w:val="clear" w:color="auto" w:fill="FFFFFF"/>
-          </w:tcPr>
-          <w:p>
-            <w:r>
-              <w:rPr>
-                <w:b w:val="0"/>
-                <w:i w:val="0"/>
-                <w:color w:val="000000"/>
-                <w:sz w:val="18"/>
-              </w:rPr>
-              <w:t>"What you saw today is Infoblox taking your Intune compliance data — something you already have — and surfacing it as a network risk signal. Noncompliant devices aren't just an MDM problem anymore. They're network-visible assets with a known location, a CrowdStrike threat rating, and a countdown timer. That's the story we're building toward — and even today, without IP location, the compliance + threat correlation stands on its own."</w:t>
-            </w:r>
-          </w:p>
         </w:tc>
       </w:tr>
     </w:tbl>

</xml_diff>

<commit_message>
Add CrowdStrike Falcon integration brief + fix skill URL catalog
fixes/CrowdStrike_Falcon_Bugs.xlsx (new):
  - Bug Registry: 6 bugs (BUG-001 alert data not surfaced → BUG-006 agent version not mapped)
  - Examples: lsys-nyc-lap-0801 (2 Critical alerts, all 6 bugs) + lsys-blr-lap-0001 (working inventory)
  - How to Reproduce: token, alert fetch, device entity fetch, UAI comparison steps

fixes/UAI_Integrations_Playbook.docx:
  - Integration #2 CrowdStrike Falcon filled: Quick Reference, Use Cases (UC-1–UC-10),
    Talk Track, Discovery Questions, Qualification Guide

fixes/assets_of_interest_tracker.docx:
  - SCENARIO-003 added: CrowdStrike Falcon endpoint inventory coverage (READY)

.claude/commands/vendor-brief.md:
  - Corrected App Runner URLs for all 10 vendors (CrowdStrike, Mist, Meraki, Jamf,
    Tenable, ServiceNow, VMware vCenter, Ordr all had stale URLs)

Co-Authored-By: Claude Sonnet 4.6 <noreply@anthropic.com>
</commit_message>
<xml_diff>
--- a/fixes/assets_of_interest_tracker.docx
+++ b/fixes/assets_of_interest_tracker.docx
@@ -3468,6 +3468,324 @@
             <w:gridSpan w:val="2"/>
           </w:tcPr>
           <w:p/>
+        </w:tc>
+      </w:tr>
+      <w:tr>
+        <w:tc>
+          <w:tcPr>
+            <w:shd w:val="clear" w:color="auto" w:fill="4A0072"/>
+            <w:tcW w:w="2880" w:type="dxa"/>
+          </w:tcPr>
+          <w:p>
+            <w:pPr>
+              <w:spacing w:before="0" w:after="0"/>
+            </w:pPr>
+            <w:r>
+              <w:rPr>
+                <w:rFonts w:ascii="Calibri" w:hAnsi="Calibri"/>
+                <w:b/>
+                <w:color w:val="FFFFFF"/>
+                <w:sz w:val="20"/>
+              </w:rPr>
+              <w:t>[SCENARIO]  SCENARIO-003  ·  CrowdStrike Falcon — Endpoint Inventory Coverage</w:t>
+            </w:r>
+          </w:p>
+        </w:tc>
+        <w:tc>
+          <w:tcPr>
+            <w:shd w:val="clear" w:color="auto" w:fill="4A0072"/>
+            <w:tcW w:w="7200" w:type="dxa"/>
+          </w:tcPr>
+          <w:p>
+            <w:pPr>
+              <w:spacing w:before="0" w:after="0"/>
+            </w:pPr>
+            <w:r>
+              <w:rPr>
+                <w:rFonts w:ascii="Calibri" w:hAnsi="Calibri"/>
+                <w:b/>
+                <w:color w:val="FFFFFF"/>
+                <w:sz w:val="18"/>
+              </w:rPr>
+            </w:r>
+          </w:p>
+        </w:tc>
+      </w:tr>
+      <w:tr>
+        <w:tc>
+          <w:tcPr>
+            <w:tcW w:type="dxa" w:w="1984"/>
+            <w:shd w:val="clear" w:color="auto" w:fill="EEF3F8"/>
+          </w:tcPr>
+          <w:p>
+            <w:pPr>
+              <w:spacing w:before="0" w:after="0"/>
+            </w:pPr>
+            <w:r>
+              <w:rPr>
+                <w:rFonts w:ascii="Calibri" w:hAnsi="Calibri"/>
+                <w:b w:val="0"/>
+                <w:sz w:val="18"/>
+              </w:rPr>
+              <w:t>Scenario</w:t>
+            </w:r>
+          </w:p>
+        </w:tc>
+        <w:tc>
+          <w:tcPr>
+            <w:tcW w:type="dxa" w:w="5953"/>
+            <w:shd w:val="clear" w:color="auto" w:fill="FFFFFF"/>
+          </w:tcPr>
+          <w:p>
+            <w:pPr>
+              <w:spacing w:before="0" w:after="0"/>
+            </w:pPr>
+            <w:r>
+              <w:rPr>
+                <w:rFonts w:ascii="Calibri" w:hAnsi="Calibri"/>
+                <w:b w:val="0"/>
+                <w:sz w:val="18"/>
+              </w:rPr>
+              <w:t>Identify endpoints with multi-source coverage: CrowdStrike Falcon + ServiceNow + Mist + Ordr — find devices seen by all four tools for highest-confidence inventory</w:t>
+            </w:r>
+          </w:p>
+        </w:tc>
+      </w:tr>
+      <w:tr>
+        <w:tc>
+          <w:tcPr>
+            <w:tcW w:type="dxa" w:w="1984"/>
+            <w:shd w:val="clear" w:color="auto" w:fill="EEF3F8"/>
+          </w:tcPr>
+          <w:p>
+            <w:pPr>
+              <w:spacing w:before="0" w:after="0"/>
+            </w:pPr>
+            <w:r>
+              <w:rPr>
+                <w:rFonts w:ascii="Calibri" w:hAnsi="Calibri"/>
+                <w:b w:val="0"/>
+                <w:sz w:val="18"/>
+              </w:rPr>
+              <w:t>Status</w:t>
+            </w:r>
+          </w:p>
+        </w:tc>
+        <w:tc>
+          <w:tcPr>
+            <w:tcW w:type="dxa" w:w="5953"/>
+            <w:shd w:val="clear" w:color="auto" w:fill="E8F5E9"/>
+          </w:tcPr>
+          <w:p>
+            <w:pPr>
+              <w:spacing w:before="0" w:after="0"/>
+            </w:pPr>
+            <w:r>
+              <w:rPr>
+                <w:rFonts w:ascii="Calibri" w:hAnsi="Calibri"/>
+                <w:b/>
+                <w:color w:val="1B5E20"/>
+                <w:sz w:val="18"/>
+              </w:rPr>
+              <w:t>READY — 999 CS endpoints live, multi-source merge confirmed for Luminary fleet</w:t>
+            </w:r>
+          </w:p>
+        </w:tc>
+      </w:tr>
+      <w:tr>
+        <w:tc>
+          <w:tcPr>
+            <w:tcW w:type="dxa" w:w="1984"/>
+            <w:shd w:val="clear" w:color="auto" w:fill="EEF3F8"/>
+          </w:tcPr>
+          <w:p>
+            <w:pPr>
+              <w:spacing w:before="0" w:after="0"/>
+            </w:pPr>
+            <w:r>
+              <w:rPr>
+                <w:rFonts w:ascii="Calibri" w:hAnsi="Calibri"/>
+                <w:b w:val="0"/>
+                <w:sz w:val="18"/>
+              </w:rPr>
+              <w:t>UAI Demo Action</w:t>
+            </w:r>
+          </w:p>
+        </w:tc>
+        <w:tc>
+          <w:tcPr>
+            <w:tcW w:type="dxa" w:w="5953"/>
+            <w:shd w:val="clear" w:color="auto" w:fill="FFFFFF"/>
+          </w:tcPr>
+          <w:p>
+            <w:pPr>
+              <w:spacing w:before="0" w:after="0"/>
+            </w:pPr>
+            <w:r>
+              <w:rPr>
+                <w:rFonts w:ascii="Calibri" w:hAnsi="Calibri"/>
+                <w:b w:val="0"/>
+                <w:sz w:val="18"/>
+              </w:rPr>
+              <w:t>Asset Insights → Assets → Source: CrowdStrike Falcon → Select lsys-blr-lap-0001 → show Sources: CS + ServiceNow + Mist + Ordr merged. Highlight OS string 'Windows 11 Pro (Build 26100) - Kernel 10.0.26100.7623' and dual IP visibility.</w:t>
+            </w:r>
+          </w:p>
+        </w:tc>
+      </w:tr>
+      <w:tr>
+        <w:tc>
+          <w:tcPr>
+            <w:tcW w:type="dxa" w:w="1984"/>
+            <w:shd w:val="clear" w:color="auto" w:fill="EEF3F8"/>
+          </w:tcPr>
+          <w:p>
+            <w:pPr>
+              <w:spacing w:before="0" w:after="0"/>
+            </w:pPr>
+            <w:r>
+              <w:rPr>
+                <w:rFonts w:ascii="Calibri" w:hAnsi="Calibri"/>
+                <w:b w:val="0"/>
+                <w:sz w:val="18"/>
+              </w:rPr>
+              <w:t>Blocked/Pending</w:t>
+            </w:r>
+          </w:p>
+        </w:tc>
+        <w:tc>
+          <w:tcPr>
+            <w:tcW w:type="dxa" w:w="5953"/>
+            <w:shd w:val="clear" w:color="auto" w:fill="FFFFFF"/>
+          </w:tcPr>
+          <w:p>
+            <w:pPr>
+              <w:spacing w:before="0" w:after="0"/>
+            </w:pPr>
+            <w:r>
+              <w:rPr>
+                <w:rFonts w:ascii="Calibri" w:hAnsi="Calibri"/>
+                <w:b w:val="0"/>
+                <w:sz w:val="18"/>
+              </w:rPr>
+              <w:t>BUG-001: Alert data not surfaced · BUG-002: Containment status not mapped · BUGs 003-006: Security field gaps. See CrowdStrike_Falcon_Bugs.xlsx.</w:t>
+            </w:r>
+          </w:p>
+        </w:tc>
+      </w:tr>
+      <w:tr>
+        <w:tc>
+          <w:tcPr>
+            <w:tcW w:type="dxa" w:w="1984"/>
+            <w:shd w:val="clear" w:color="auto" w:fill="EEF3F8"/>
+          </w:tcPr>
+          <w:p>
+            <w:pPr>
+              <w:spacing w:before="0" w:after="0"/>
+            </w:pPr>
+            <w:r>
+              <w:rPr>
+                <w:rFonts w:ascii="Calibri" w:hAnsi="Calibri"/>
+                <w:b w:val="0"/>
+                <w:sz w:val="18"/>
+              </w:rPr>
+              <w:t>Mock Data</w:t>
+            </w:r>
+          </w:p>
+        </w:tc>
+        <w:tc>
+          <w:tcPr>
+            <w:tcW w:type="dxa" w:w="5953"/>
+            <w:shd w:val="clear" w:color="auto" w:fill="FFFFFF"/>
+          </w:tcPr>
+          <w:p>
+            <w:pPr>
+              <w:spacing w:before="0" w:after="0"/>
+            </w:pPr>
+            <w:r>
+              <w:rPr>
+                <w:rFonts w:ascii="Calibri" w:hAnsi="Calibri"/>
+                <w:b w:val="0"/>
+                <w:sz w:val="18"/>
+              </w:rPr>
+              <w:t>999 devices (Windows 11 + macOS 15), 103 alerts (3 severities), zone groups: APAC/EMEA/Americas. All CS fields in raw_provider_data; security fields not yet mapped to UAI attributes.</w:t>
+            </w:r>
+          </w:p>
+        </w:tc>
+      </w:tr>
+      <w:tr>
+        <w:tc>
+          <w:tcPr>
+            <w:tcW w:type="dxa" w:w="1984"/>
+            <w:shd w:val="clear" w:color="auto" w:fill="EEF3F8"/>
+          </w:tcPr>
+          <w:p>
+            <w:pPr>
+              <w:spacing w:before="0" w:after="0"/>
+            </w:pPr>
+            <w:r>
+              <w:rPr>
+                <w:rFonts w:ascii="Calibri" w:hAnsi="Calibri"/>
+                <w:b w:val="0"/>
+                <w:sz w:val="18"/>
+              </w:rPr>
+              <w:t>Date Added</w:t>
+            </w:r>
+          </w:p>
+        </w:tc>
+        <w:tc>
+          <w:tcPr>
+            <w:tcW w:type="dxa" w:w="5953"/>
+            <w:shd w:val="clear" w:color="auto" w:fill="FFFFFF"/>
+          </w:tcPr>
+          <w:p>
+            <w:pPr>
+              <w:spacing w:before="0" w:after="0"/>
+            </w:pPr>
+            <w:r>
+              <w:rPr>
+                <w:rFonts w:ascii="Calibri" w:hAnsi="Calibri"/>
+                <w:b w:val="0"/>
+                <w:sz w:val="18"/>
+              </w:rPr>
+              <w:t>2026-07-04</w:t>
+            </w:r>
+          </w:p>
+        </w:tc>
+      </w:tr>
+      <w:tr>
+        <w:tc>
+          <w:tcPr>
+            <w:tcW w:type="dxa" w:w="1984"/>
+          </w:tcPr>
+          <w:p>
+            <w:pPr>
+              <w:spacing w:before="0" w:after="0"/>
+            </w:pPr>
+            <w:r>
+              <w:rPr>
+                <w:rFonts w:ascii="Calibri" w:hAnsi="Calibri"/>
+                <w:b w:val="0"/>
+                <w:sz w:val="18"/>
+              </w:rPr>
+            </w:r>
+          </w:p>
+        </w:tc>
+        <w:tc>
+          <w:tcPr>
+            <w:tcW w:type="dxa" w:w="5953"/>
+          </w:tcPr>
+          <w:p>
+            <w:pPr>
+              <w:spacing w:before="0" w:after="0"/>
+            </w:pPr>
+            <w:r>
+              <w:rPr>
+                <w:rFonts w:ascii="Calibri" w:hAnsi="Calibri"/>
+                <w:b w:val="0"/>
+                <w:sz w:val="18"/>
+              </w:rPr>
+            </w:r>
+          </w:p>
         </w:tc>
       </w:tr>
     </w:tbl>

</xml_diff>